<commit_message>
Publish revised announcement and registration form
</commit_message>
<xml_diff>
--- a/public/dao/dao19-announcement.docx
+++ b/public/dao/dao19-announcement.docx
@@ -1,6 +1,6 @@
 
 <file path=word/document.xml><?xml version="1.0" encoding="utf-8"?>
-<w:document xmlns:wpc="http://schemas.microsoft.com/office/word/2010/wordprocessingCanvas" xmlns:mc="http://schemas.openxmlformats.org/markup-compatibility/2006" xmlns:o="urn:schemas-microsoft-com:office:office" xmlns:r="http://schemas.openxmlformats.org/officeDocument/2006/relationships" xmlns:m="http://schemas.openxmlformats.org/officeDocument/2006/math" xmlns:v="urn:schemas-microsoft-com:vml" xmlns:wp14="http://schemas.microsoft.com/office/word/2010/wordprocessingDrawing" xmlns:wp="http://schemas.openxmlformats.org/drawingml/2006/wordprocessingDrawing" xmlns:w="http://schemas.openxmlformats.org/wordprocessingml/2006/main" xmlns:w14="http://schemas.microsoft.com/office/word/2010/wordml" xmlns:w10="urn:schemas-microsoft-com:office:word" xmlns:w15="http://schemas.microsoft.com/office/word/2012/wordml" xmlns:wpg="http://schemas.microsoft.com/office/word/2010/wordprocessingGroup" xmlns:wpi="http://schemas.microsoft.com/office/word/2010/wordprocessingInk" xmlns:wne="http://schemas.microsoft.com/office/word/2006/wordml" xmlns:wps="http://schemas.microsoft.com/office/word/2010/wordprocessingShape" xmlns:wpsCustomData="http://www.wps.cn/officeDocument/2013/wpsCustomData" mc:Ignorable="w14 w15 wp14">
+<w:document xmlns:wpc="http://schemas.microsoft.com/office/word/2010/wordprocessingCanvas" xmlns:cx="http://schemas.microsoft.com/office/drawing/2014/chartex" xmlns:cx1="http://schemas.microsoft.com/office/drawing/2015/9/8/chartex" xmlns:cx2="http://schemas.microsoft.com/office/drawing/2015/10/21/chartex" xmlns:cx3="http://schemas.microsoft.com/office/drawing/2016/5/9/chartex" xmlns:cx4="http://schemas.microsoft.com/office/drawing/2016/5/10/chartex" xmlns:cx5="http://schemas.microsoft.com/office/drawing/2016/5/11/chartex" xmlns:cx6="http://schemas.microsoft.com/office/drawing/2016/5/12/chartex" xmlns:cx7="http://schemas.microsoft.com/office/drawing/2016/5/13/chartex" xmlns:cx8="http://schemas.microsoft.com/office/drawing/2016/5/14/chartex" xmlns:mc="http://schemas.openxmlformats.org/markup-compatibility/2006" xmlns:o="urn:schemas-microsoft-com:office:office" xmlns:r="http://schemas.openxmlformats.org/officeDocument/2006/relationships" xmlns:m="http://schemas.openxmlformats.org/officeDocument/2006/math" xmlns:v="urn:schemas-microsoft-com:vml" xmlns:wp14="http://schemas.microsoft.com/office/word/2010/wordprocessingDrawing" xmlns:wp="http://schemas.openxmlformats.org/drawingml/2006/wordprocessingDrawing" xmlns:w="http://schemas.openxmlformats.org/wordprocessingml/2006/main" xmlns:w14="http://schemas.microsoft.com/office/word/2010/wordml" xmlns:w10="urn:schemas-microsoft-com:office:word" xmlns:w15="http://schemas.microsoft.com/office/word/2012/wordml" xmlns:wpg="http://schemas.microsoft.com/office/word/2010/wordprocessingGroup" xmlns:wpi="http://schemas.microsoft.com/office/word/2010/wordprocessingInk" xmlns:wne="http://schemas.microsoft.com/office/word/2006/wordml" xmlns:wps="http://schemas.microsoft.com/office/word/2010/wordprocessingShape" xmlns:wpsCustomData="http://www.wps.cn/officeDocument/2013/wpsCustomData" mc:Ignorable="w14 w15 wp14">
   <w:body>
     <w:p>
       <w:pPr>
@@ -270,7 +270,7 @@
     </w:p>
     <w:p>
       <w:pPr>
-        <w:pStyle w:val="13"/>
+        <w:pStyle w:val="14"/>
         <w:keepNext w:val="0"/>
         <w:keepLines w:val="0"/>
         <w:pageBreakBefore w:val="0"/>
@@ -289,7 +289,7 @@
       </w:pPr>
       <w:r>
         <w:rPr>
-          <w:rStyle w:val="9"/>
+          <w:rStyle w:val="10"/>
           <w:rFonts w:ascii="Arial" w:hAnsi="Arial" w:eastAsia="宋体" w:cs="Arial"/>
           <w:b w:val="0"/>
           <w:bCs w:val="0"/>
@@ -303,7 +303,7 @@
       </w:r>
       <w:r>
         <w:rPr>
-          <w:rStyle w:val="9"/>
+          <w:rStyle w:val="10"/>
           <w:rFonts w:ascii="Arial" w:hAnsi="Arial" w:eastAsia="宋体" w:cs="Arial"/>
           <w:b w:val="0"/>
           <w:bCs w:val="0"/>
@@ -318,7 +318,7 @@
       </w:r>
       <w:r>
         <w:rPr>
-          <w:rStyle w:val="9"/>
+          <w:rStyle w:val="10"/>
           <w:rFonts w:ascii="Arial" w:hAnsi="Arial" w:eastAsia="宋体" w:cs="Arial"/>
           <w:b w:val="0"/>
           <w:bCs w:val="0"/>
@@ -332,7 +332,7 @@
       </w:r>
       <w:r>
         <w:rPr>
-          <w:rStyle w:val="9"/>
+          <w:rStyle w:val="10"/>
           <w:rFonts w:hint="eastAsia" w:ascii="Arial" w:hAnsi="Arial" w:eastAsia="宋体" w:cs="Arial"/>
           <w:b w:val="0"/>
           <w:bCs w:val="0"/>
@@ -387,7 +387,7 @@
     </w:p>
     <w:p>
       <w:pPr>
-        <w:pStyle w:val="13"/>
+        <w:pStyle w:val="14"/>
         <w:keepNext w:val="0"/>
         <w:keepLines w:val="0"/>
         <w:pageBreakBefore w:val="0"/>
@@ -462,7 +462,7 @@
     </w:p>
     <w:p>
       <w:pPr>
-        <w:pStyle w:val="13"/>
+        <w:pStyle w:val="14"/>
         <w:keepNext w:val="0"/>
         <w:keepLines w:val="0"/>
         <w:pageBreakBefore w:val="0"/>
@@ -537,7 +537,7 @@
     </w:p>
     <w:p>
       <w:pPr>
-        <w:pStyle w:val="13"/>
+        <w:pStyle w:val="14"/>
         <w:keepNext w:val="0"/>
         <w:keepLines w:val="0"/>
         <w:pageBreakBefore w:val="0"/>
@@ -625,7 +625,7 @@
     </w:p>
     <w:p>
       <w:pPr>
-        <w:pStyle w:val="13"/>
+        <w:pStyle w:val="14"/>
         <w:keepNext w:val="0"/>
         <w:keepLines w:val="0"/>
         <w:pageBreakBefore w:val="0"/>
@@ -701,7 +701,7 @@
     </w:p>
     <w:p>
       <w:pPr>
-        <w:pStyle w:val="13"/>
+        <w:pStyle w:val="14"/>
         <w:keepNext w:val="0"/>
         <w:keepLines w:val="0"/>
         <w:pageBreakBefore w:val="0"/>
@@ -776,7 +776,7 @@
     </w:p>
     <w:p>
       <w:pPr>
-        <w:pStyle w:val="13"/>
+        <w:pStyle w:val="14"/>
         <w:keepNext w:val="0"/>
         <w:keepLines w:val="0"/>
         <w:pageBreakBefore w:val="0"/>
@@ -864,7 +864,7 @@
     </w:p>
     <w:p>
       <w:pPr>
-        <w:pStyle w:val="13"/>
+        <w:pStyle w:val="14"/>
         <w:keepNext w:val="0"/>
         <w:keepLines w:val="0"/>
         <w:pageBreakBefore w:val="0"/>
@@ -3128,7 +3128,7 @@
         <w:jc w:val="both"/>
         <w:textAlignment w:val="auto"/>
         <w:rPr>
-          <w:color w:val="FF0000"/>
+          <w:color w:val="auto"/>
         </w:rPr>
       </w:pPr>
       <w:r>
@@ -3136,12 +3136,178 @@
           <w:rFonts w:ascii="Arial" w:hAnsi="Arial" w:eastAsia="Arial-BoldMT" w:cs="Arial"/>
           <w:b/>
           <w:bCs/>
+          <w:color w:val="auto"/>
+          <w:sz w:val="21"/>
+          <w:szCs w:val="21"/>
+          <w:shd w:val="clear" w:fill="auto"/>
+        </w:rPr>
+        <w:t>REGISTRATION</w:t>
+      </w:r>
+    </w:p>
+    <w:p>
+      <w:pPr>
+        <w:keepNext w:val="0"/>
+        <w:keepLines w:val="0"/>
+        <w:pageBreakBefore w:val="0"/>
+        <w:widowControl w:val="0"/>
+        <w:kinsoku/>
+        <w:wordWrap/>
+        <w:overflowPunct/>
+        <w:topLinePunct w:val="0"/>
+        <w:autoSpaceDE/>
+        <w:autoSpaceDN/>
+        <w:bidi w:val="0"/>
+        <w:adjustRightInd/>
+        <w:snapToGrid/>
+        <w:spacing w:line="240" w:lineRule="auto"/>
+        <w:jc w:val="left"/>
+        <w:textAlignment w:val="auto"/>
+        <w:rPr>
+          <w:color w:val="000000"/>
+        </w:rPr>
+      </w:pPr>
+      <w:r>
+        <w:rPr>
+          <w:rFonts w:hint="eastAsia" w:ascii="Arial" w:hAnsi="Arial" w:eastAsia="宋体" w:cs="Arial"/>
+          <w:b w:val="0"/>
+          <w:bCs w:val="0"/>
           <w:color w:val="FF0000"/>
           <w:sz w:val="21"/>
           <w:szCs w:val="21"/>
           <w:shd w:val="clear" w:fill="auto"/>
-        </w:rPr>
-        <w:t>REGISTRATION</w:t>
+          <w:lang w:val="en-US" w:eastAsia="zh-CN"/>
+        </w:rPr>
+        <w:t xml:space="preserve">Register at </w:t>
+      </w:r>
+      <w:r>
+        <w:rPr>
+          <w:rFonts w:hint="eastAsia" w:ascii="Arial" w:hAnsi="Arial" w:eastAsia="宋体" w:cs="Arial"/>
+          <w:b w:val="0"/>
+          <w:bCs w:val="0"/>
+          <w:color w:val="FF0000"/>
+          <w:sz w:val="21"/>
+          <w:szCs w:val="21"/>
+          <w:shd w:val="clear" w:fill="auto"/>
+          <w:lang w:val="en-US" w:eastAsia="zh-CN"/>
+        </w:rPr>
+        <w:fldChar w:fldCharType="begin"/>
+      </w:r>
+      <w:r>
+        <w:rPr>
+          <w:rFonts w:hint="eastAsia" w:ascii="Arial" w:hAnsi="Arial" w:eastAsia="宋体" w:cs="Arial"/>
+          <w:b w:val="0"/>
+          <w:bCs w:val="0"/>
+          <w:color w:val="FF0000"/>
+          <w:sz w:val="21"/>
+          <w:szCs w:val="21"/>
+          <w:shd w:val="clear" w:fill="auto"/>
+          <w:lang w:val="en-US" w:eastAsia="zh-CN"/>
+        </w:rPr>
+        <w:instrText xml:space="preserve"> HYPERLINK "https://forms.cloud.microsoft/r/7c8DrdS0dw" </w:instrText>
+      </w:r>
+      <w:r>
+        <w:rPr>
+          <w:rFonts w:hint="eastAsia" w:ascii="Arial" w:hAnsi="Arial" w:eastAsia="宋体" w:cs="Arial"/>
+          <w:b w:val="0"/>
+          <w:bCs w:val="0"/>
+          <w:color w:val="FF0000"/>
+          <w:sz w:val="21"/>
+          <w:szCs w:val="21"/>
+          <w:shd w:val="clear" w:fill="auto"/>
+          <w:lang w:val="en-US" w:eastAsia="zh-CN"/>
+        </w:rPr>
+        <w:fldChar w:fldCharType="separate"/>
+      </w:r>
+      <w:r>
+        <w:rPr>
+          <w:rStyle w:val="9"/>
+          <w:rFonts w:hint="eastAsia" w:ascii="Arial" w:hAnsi="Arial" w:eastAsia="宋体" w:cs="Arial"/>
+          <w:b w:val="0"/>
+          <w:bCs w:val="0"/>
+          <w:sz w:val="21"/>
+          <w:szCs w:val="21"/>
+          <w:shd w:val="clear" w:fill="auto"/>
+          <w:lang w:val="en-US" w:eastAsia="zh-CN"/>
+        </w:rPr>
+        <w:t>https://forms.cloud.microsoft/r/7c8D</w:t>
+      </w:r>
+      <w:bookmarkStart w:id="2" w:name="_GoBack"/>
+      <w:bookmarkEnd w:id="2"/>
+      <w:r>
+        <w:rPr>
+          <w:rStyle w:val="9"/>
+          <w:rFonts w:hint="eastAsia" w:ascii="Arial" w:hAnsi="Arial" w:eastAsia="宋体" w:cs="Arial"/>
+          <w:b w:val="0"/>
+          <w:bCs w:val="0"/>
+          <w:sz w:val="21"/>
+          <w:szCs w:val="21"/>
+          <w:shd w:val="clear" w:fill="auto"/>
+          <w:lang w:val="en-US" w:eastAsia="zh-CN"/>
+        </w:rPr>
+        <w:t>rdS0dw</w:t>
+      </w:r>
+      <w:r>
+        <w:rPr>
+          <w:rFonts w:hint="eastAsia" w:ascii="Arial" w:hAnsi="Arial" w:eastAsia="宋体" w:cs="Arial"/>
+          <w:b w:val="0"/>
+          <w:bCs w:val="0"/>
+          <w:color w:val="FF0000"/>
+          <w:sz w:val="21"/>
+          <w:szCs w:val="21"/>
+          <w:shd w:val="clear" w:fill="auto"/>
+          <w:lang w:val="en-US" w:eastAsia="zh-CN"/>
+        </w:rPr>
+        <w:fldChar w:fldCharType="end"/>
+      </w:r>
+      <w:r>
+        <w:rPr>
+          <w:rFonts w:hint="eastAsia" w:ascii="Arial" w:hAnsi="Arial" w:eastAsia="宋体" w:cs="Arial"/>
+          <w:b w:val="0"/>
+          <w:bCs w:val="0"/>
+          <w:color w:val="FF0000"/>
+          <w:sz w:val="21"/>
+          <w:szCs w:val="21"/>
+          <w:shd w:val="clear" w:fill="auto"/>
+          <w:lang w:val="en-US" w:eastAsia="zh-CN"/>
+        </w:rPr>
+        <w:t xml:space="preserve"> Or s</w:t>
+      </w:r>
+      <w:r>
+        <w:rPr>
+          <w:rFonts w:ascii="Arial" w:hAnsi="Arial" w:eastAsia="Arial MT" w:cs="Arial"/>
+          <w:b w:val="0"/>
+          <w:bCs w:val="0"/>
+          <w:color w:val="FF0000"/>
+          <w:sz w:val="21"/>
+          <w:szCs w:val="21"/>
+          <w:shd w:val="clear" w:fill="auto"/>
+        </w:rPr>
+        <w:t>end a</w:t>
+      </w:r>
+      <w:r>
+        <w:rPr>
+          <w:rFonts w:hint="eastAsia" w:ascii="Arial" w:hAnsi="Arial" w:eastAsia="宋体" w:cs="Arial"/>
+          <w:b w:val="0"/>
+          <w:bCs w:val="0"/>
+          <w:color w:val="FF0000"/>
+          <w:sz w:val="21"/>
+          <w:szCs w:val="21"/>
+          <w:shd w:val="clear" w:fill="auto"/>
+          <w:lang w:val="en-US" w:eastAsia="zh-CN"/>
+        </w:rPr>
+        <w:t xml:space="preserve"> form</w:t>
+      </w:r>
+      <w:r>
+        <w:rPr>
+          <w:rFonts w:ascii="Arial" w:hAnsi="Arial" w:eastAsia="Arial MT" w:cs="Arial"/>
+          <w:b w:val="0"/>
+          <w:bCs w:val="0"/>
+          <w:color w:val="000000"/>
+          <w:sz w:val="21"/>
+          <w:szCs w:val="21"/>
+          <w:shd w:val="clear" w:fill="auto"/>
+        </w:rPr>
+        <w:t xml:space="preserve"> containing</w:t>
       </w:r>
     </w:p>
     <w:p>
@@ -3162,19 +3328,6 @@
       </w:pPr>
       <w:r>
         <w:rPr>
-          <w:rFonts w:ascii="Arial" w:hAnsi="Arial" w:eastAsia="宋体" w:cs="Arial"/>
-          <w:b w:val="0"/>
-          <w:bCs w:val="0"/>
-          <w:color w:val="000000"/>
-          <w:sz w:val="21"/>
-          <w:szCs w:val="21"/>
-          <w:shd w:val="clear" w:fill="auto"/>
-          <w:lang w:val="en-US" w:eastAsia="zh-CN"/>
-        </w:rPr>
-        <w:t>S</w:t>
-      </w:r>
-      <w:r>
-        <w:rPr>
           <w:rFonts w:ascii="Arial" w:hAnsi="Arial" w:eastAsia="Arial MT" w:cs="Arial"/>
           <w:b w:val="0"/>
           <w:bCs w:val="0"/>
@@ -3183,7 +3336,7 @@
           <w:szCs w:val="21"/>
           <w:shd w:val="clear" w:fill="auto"/>
         </w:rPr>
-        <w:t>end an email containing</w:t>
+        <w:t>name, institution, nationality, ID or passport number, email address, and phone number, plus paper title (if presenting)</w:t>
       </w:r>
     </w:p>
     <w:p>
@@ -3198,9 +3351,6 @@
         <w:spacing w:line="240" w:lineRule="auto"/>
         <w:jc w:val="both"/>
         <w:textAlignment w:val="auto"/>
-        <w:rPr>
-          <w:color w:val="000000"/>
-        </w:rPr>
       </w:pPr>
       <w:r>
         <w:rPr>
@@ -3212,7 +3362,84 @@
           <w:szCs w:val="21"/>
           <w:shd w:val="clear" w:fill="auto"/>
         </w:rPr>
-        <w:t>name, institution, nationality, ID or passport number, email address, and phone number, plus paper title (if presenting)</w:t>
+        <w:t xml:space="preserve">to </w:t>
+      </w:r>
+      <w:r>
+        <w:rPr>
+          <w:color w:val="FF0000"/>
+        </w:rPr>
+        <w:fldChar w:fldCharType="begin"/>
+      </w:r>
+      <w:r>
+        <w:rPr>
+          <w:color w:val="FF0000"/>
+        </w:rPr>
+        <w:instrText xml:space="preserve"> HYPERLINK "mailto:sduforum@163.com" \h </w:instrText>
+      </w:r>
+      <w:r>
+        <w:rPr>
+          <w:color w:val="FF0000"/>
+        </w:rPr>
+        <w:fldChar w:fldCharType="separate"/>
+      </w:r>
+      <w:r>
+        <w:rPr>
+          <w:rStyle w:val="10"/>
+          <w:rFonts w:hint="eastAsia" w:ascii="Arial" w:hAnsi="Arial" w:eastAsia="宋体" w:cs="Arial"/>
+          <w:b/>
+          <w:bCs/>
+          <w:color w:val="FF0000"/>
+          <w:sz w:val="21"/>
+          <w:szCs w:val="21"/>
+          <w:u w:val="none"/>
+          <w:shd w:val="clear" w:fill="auto"/>
+          <w:lang w:val="en-US" w:eastAsia="zh-CN"/>
+        </w:rPr>
+        <w:t>sduforum</w:t>
+      </w:r>
+      <w:r>
+        <w:rPr>
+          <w:rStyle w:val="10"/>
+          <w:rFonts w:ascii="Arial" w:hAnsi="Arial" w:eastAsia="宋体" w:cs="Arial"/>
+          <w:b/>
+          <w:bCs/>
+          <w:color w:val="FF0000"/>
+          <w:sz w:val="21"/>
+          <w:szCs w:val="21"/>
+          <w:u w:val="none"/>
+          <w:shd w:val="clear" w:fill="auto"/>
+          <w:lang w:val="en-US" w:eastAsia="zh-CN"/>
+        </w:rPr>
+        <w:t>@163.com</w:t>
+      </w:r>
+      <w:r>
+        <w:rPr>
+          <w:rStyle w:val="10"/>
+          <w:rFonts w:ascii="Arial" w:hAnsi="Arial" w:eastAsia="宋体" w:cs="Arial"/>
+          <w:b/>
+          <w:bCs/>
+          <w:color w:val="FF0000"/>
+          <w:sz w:val="21"/>
+          <w:szCs w:val="21"/>
+          <w:u w:val="none"/>
+          <w:shd w:val="clear" w:fill="auto"/>
+          <w:lang w:val="en-US" w:eastAsia="zh-CN"/>
+        </w:rPr>
+        <w:fldChar w:fldCharType="end"/>
+      </w:r>
+      <w:r>
+        <w:rPr>
+          <w:rFonts w:hint="eastAsia" w:ascii="Arial" w:hAnsi="Arial" w:eastAsia="宋体" w:cs="Arial"/>
+          <w:b w:val="0"/>
+          <w:bCs w:val="0"/>
+          <w:color w:val="000000"/>
+          <w:sz w:val="21"/>
+          <w:szCs w:val="21"/>
+          <w:u w:val="none"/>
+          <w:shd w:val="clear" w:fill="auto"/>
+          <w:lang w:val="en-US" w:eastAsia="zh-CN"/>
+        </w:rPr>
+        <w:t>.</w:t>
       </w:r>
     </w:p>
     <w:p>
@@ -3227,34 +3454,15 @@
         <w:spacing w:line="240" w:lineRule="auto"/>
         <w:jc w:val="both"/>
         <w:textAlignment w:val="auto"/>
-      </w:pPr>
-      <w:r>
-        <w:rPr>
-          <w:rFonts w:ascii="Arial" w:hAnsi="Arial" w:eastAsia="Arial MT" w:cs="Arial"/>
-          <w:b w:val="0"/>
-          <w:bCs w:val="0"/>
-          <w:color w:val="000000"/>
-          <w:sz w:val="21"/>
-          <w:szCs w:val="21"/>
-          <w:shd w:val="clear" w:fill="auto"/>
-        </w:rPr>
-        <w:t xml:space="preserve">to </w:t>
-      </w:r>
-      <w:r>
-        <w:fldChar w:fldCharType="begin"/>
-      </w:r>
-      <w:r>
-        <w:instrText xml:space="preserve"> HYPERLINK "mailto:%3Chkhongdao100@163.com%3E" \h </w:instrText>
-      </w:r>
-      <w:r>
-        <w:fldChar w:fldCharType="separate"/>
-      </w:r>
-      <w:r>
-        <w:rPr>
-          <w:rStyle w:val="9"/>
-          <w:rFonts w:ascii="Arial" w:hAnsi="Arial" w:eastAsia="宋体" w:cs="Arial"/>
-          <w:b/>
-          <w:bCs/>
+        <w:rPr>
+          <w:color w:val="000000"/>
+        </w:rPr>
+      </w:pPr>
+      <w:r>
+        <w:rPr>
+          <w:rFonts w:hint="eastAsia" w:ascii="Arial" w:hAnsi="Arial" w:eastAsia="宋体" w:cs="Arial"/>
+          <w:b w:val="0"/>
+          <w:bCs w:val="0"/>
           <w:color w:val="000000"/>
           <w:sz w:val="21"/>
           <w:szCs w:val="21"/>
@@ -3262,14 +3470,13 @@
           <w:shd w:val="clear" w:fill="auto"/>
           <w:lang w:val="en-US" w:eastAsia="zh-CN"/>
         </w:rPr>
-        <w:t>hkhongdao100@ 163.com</w:t>
-      </w:r>
-      <w:r>
-        <w:rPr>
-          <w:rStyle w:val="9"/>
-          <w:rFonts w:ascii="Arial" w:hAnsi="Arial" w:eastAsia="宋体" w:cs="Arial"/>
-          <w:b/>
-          <w:bCs/>
+        <w:tab/>
+      </w:r>
+      <w:r>
+        <w:rPr>
+          <w:rFonts w:hint="eastAsia" w:ascii="Arial" w:hAnsi="Arial" w:eastAsia="宋体" w:cs="Arial"/>
+          <w:b w:val="0"/>
+          <w:bCs w:val="0"/>
           <w:color w:val="000000"/>
           <w:sz w:val="21"/>
           <w:szCs w:val="21"/>
@@ -3277,21 +3484,7 @@
           <w:shd w:val="clear" w:fill="auto"/>
           <w:lang w:val="en-US" w:eastAsia="zh-CN"/>
         </w:rPr>
-        <w:fldChar w:fldCharType="end"/>
-      </w:r>
-      <w:r>
-        <w:rPr>
-          <w:rFonts w:hint="eastAsia" w:ascii="Arial" w:hAnsi="Arial" w:eastAsia="宋体" w:cs="Arial"/>
-          <w:b w:val="0"/>
-          <w:bCs w:val="0"/>
-          <w:color w:val="000000"/>
-          <w:sz w:val="21"/>
-          <w:szCs w:val="21"/>
-          <w:u w:val="none"/>
-          <w:shd w:val="clear" w:fill="auto"/>
-          <w:lang w:val="en-US" w:eastAsia="zh-CN"/>
-        </w:rPr>
-        <w:t>.</w:t>
+        <w:t>Also indicate whether you want a room in the main hotel (and name of your roommate or whether you would like us to help you find someone) or will make your own arrangements and whether you intend to join the excursion.</w:t>
       </w:r>
     </w:p>
     <w:p>
@@ -3307,37 +3500,16 @@
         <w:jc w:val="both"/>
         <w:textAlignment w:val="auto"/>
         <w:rPr>
-          <w:color w:val="000000"/>
-        </w:rPr>
-      </w:pPr>
-      <w:r>
-        <w:rPr>
-          <w:rFonts w:hint="eastAsia" w:ascii="Arial" w:hAnsi="Arial" w:eastAsia="宋体" w:cs="Arial"/>
-          <w:b w:val="0"/>
-          <w:bCs w:val="0"/>
-          <w:color w:val="000000"/>
-          <w:sz w:val="21"/>
-          <w:szCs w:val="21"/>
-          <w:u w:val="none"/>
-          <w:shd w:val="clear" w:fill="auto"/>
-          <w:lang w:val="en-US" w:eastAsia="zh-CN"/>
-        </w:rPr>
-        <w:tab/>
-      </w:r>
-      <w:r>
-        <w:rPr>
-          <w:rFonts w:hint="eastAsia" w:ascii="Arial" w:hAnsi="Arial" w:eastAsia="宋体" w:cs="Arial"/>
-          <w:b w:val="0"/>
-          <w:bCs w:val="0"/>
-          <w:color w:val="000000"/>
-          <w:sz w:val="21"/>
-          <w:szCs w:val="21"/>
-          <w:u w:val="none"/>
-          <w:shd w:val="clear" w:fill="auto"/>
-          <w:lang w:val="en-US" w:eastAsia="zh-CN"/>
-        </w:rPr>
-        <w:t>Also indicate whether you want a room in the main hotel (and name of your roommate or whether you would like us to help you find someone) or will make your own arrangements and whether you intend to join the excursion.</w:t>
-      </w:r>
+          <w:rFonts w:ascii="Arial" w:hAnsi="Arial" w:eastAsia="Arial MT" w:cs="Arial"/>
+          <w:b w:val="0"/>
+          <w:bCs w:val="0"/>
+          <w:color w:val="000000"/>
+          <w:sz w:val="21"/>
+          <w:szCs w:val="21"/>
+          <w:highlight w:val="none"/>
+          <w:shd w:val="clear" w:fill="auto"/>
+        </w:rPr>
+      </w:pPr>
     </w:p>
     <w:p>
       <w:pPr>
@@ -3352,16 +3524,21 @@
         <w:jc w:val="both"/>
         <w:textAlignment w:val="auto"/>
         <w:rPr>
-          <w:rFonts w:ascii="Arial" w:hAnsi="Arial" w:eastAsia="Arial MT" w:cs="Arial"/>
-          <w:b w:val="0"/>
-          <w:bCs w:val="0"/>
-          <w:color w:val="000000"/>
-          <w:sz w:val="21"/>
-          <w:szCs w:val="21"/>
-          <w:highlight w:val="none"/>
-          <w:shd w:val="clear" w:fill="auto"/>
-        </w:rPr>
-      </w:pPr>
+          <w:color w:val="000000"/>
+        </w:rPr>
+      </w:pPr>
+      <w:r>
+        <w:rPr>
+          <w:rFonts w:ascii="Arial" w:hAnsi="Arial" w:eastAsia="Arial-BoldMT" w:cs="Arial"/>
+          <w:b/>
+          <w:bCs/>
+          <w:color w:val="000000"/>
+          <w:sz w:val="21"/>
+          <w:szCs w:val="21"/>
+          <w:shd w:val="clear" w:fill="auto"/>
+        </w:rPr>
+        <w:t>DEADLINES</w:t>
+      </w:r>
     </w:p>
     <w:p>
       <w:pPr>
@@ -3381,15 +3558,53 @@
       </w:pPr>
       <w:r>
         <w:rPr>
-          <w:rFonts w:ascii="Arial" w:hAnsi="Arial" w:eastAsia="Arial-BoldMT" w:cs="Arial"/>
-          <w:b/>
-          <w:bCs/>
-          <w:color w:val="000000"/>
-          <w:sz w:val="21"/>
-          <w:szCs w:val="21"/>
-          <w:shd w:val="clear" w:fill="auto"/>
-        </w:rPr>
-        <w:t>DEADLINES</w:t>
+          <w:rFonts w:ascii="Arial" w:hAnsi="Arial" w:eastAsia="Arial MT" w:cs="Arial"/>
+          <w:b w:val="0"/>
+          <w:bCs w:val="0"/>
+          <w:color w:val="000000"/>
+          <w:sz w:val="21"/>
+          <w:szCs w:val="21"/>
+          <w:shd w:val="clear" w:fill="auto"/>
+        </w:rPr>
+        <w:t xml:space="preserve">Registration closes, abstracts due: </w:t>
+      </w:r>
+      <w:r>
+        <w:rPr>
+          <w:rFonts w:hint="eastAsia" w:ascii="Arial" w:hAnsi="Arial" w:eastAsia="宋体" w:cs="Arial"/>
+          <w:b w:val="0"/>
+          <w:bCs w:val="0"/>
+          <w:color w:val="000000"/>
+          <w:sz w:val="21"/>
+          <w:szCs w:val="21"/>
+          <w:shd w:val="clear" w:fill="auto"/>
+          <w:lang w:val="en-US" w:eastAsia="zh-CN"/>
+        </w:rPr>
+        <w:t>March</w:t>
+      </w:r>
+      <w:r>
+        <w:rPr>
+          <w:rFonts w:ascii="Arial" w:hAnsi="Arial" w:eastAsia="Arial MT" w:cs="Arial"/>
+          <w:b w:val="0"/>
+          <w:bCs w:val="0"/>
+          <w:color w:val="000000"/>
+          <w:sz w:val="21"/>
+          <w:szCs w:val="21"/>
+          <w:shd w:val="clear" w:fill="auto"/>
+        </w:rPr>
+        <w:t xml:space="preserve"> 1, 20</w:t>
+      </w:r>
+      <w:r>
+        <w:rPr>
+          <w:rFonts w:ascii="Arial" w:hAnsi="Arial" w:eastAsia="宋体" w:cs="Arial"/>
+          <w:b w:val="0"/>
+          <w:bCs w:val="0"/>
+          <w:color w:val="000000"/>
+          <w:sz w:val="21"/>
+          <w:szCs w:val="21"/>
+          <w:shd w:val="clear" w:fill="auto"/>
+          <w:lang w:val="en-US" w:eastAsia="zh-CN"/>
+        </w:rPr>
+        <w:t>27.</w:t>
       </w:r>
     </w:p>
     <w:p>
@@ -3418,7 +3633,7 @@
           <w:szCs w:val="21"/>
           <w:shd w:val="clear" w:fill="auto"/>
         </w:rPr>
-        <w:t xml:space="preserve">Registration closes, abstracts due: </w:t>
+        <w:t>Program on website: April</w:t>
       </w:r>
       <w:r>
         <w:rPr>
@@ -3431,7 +3646,7 @@
           <w:shd w:val="clear" w:fill="auto"/>
           <w:lang w:val="en-US" w:eastAsia="zh-CN"/>
         </w:rPr>
-        <w:t>March</w:t>
+        <w:t xml:space="preserve"> </w:t>
       </w:r>
       <w:r>
         <w:rPr>
@@ -3443,7 +3658,7 @@
           <w:szCs w:val="21"/>
           <w:shd w:val="clear" w:fill="auto"/>
         </w:rPr>
-        <w:t xml:space="preserve"> 1, 20</w:t>
+        <w:t>1, 20</w:t>
       </w:r>
       <w:r>
         <w:rPr>
@@ -3472,59 +3687,16 @@
         <w:jc w:val="both"/>
         <w:textAlignment w:val="auto"/>
         <w:rPr>
-          <w:color w:val="000000"/>
-        </w:rPr>
-      </w:pPr>
-      <w:r>
-        <w:rPr>
-          <w:rFonts w:ascii="Arial" w:hAnsi="Arial" w:eastAsia="Arial MT" w:cs="Arial"/>
-          <w:b w:val="0"/>
-          <w:bCs w:val="0"/>
-          <w:color w:val="000000"/>
-          <w:sz w:val="21"/>
-          <w:szCs w:val="21"/>
-          <w:shd w:val="clear" w:fill="auto"/>
-        </w:rPr>
-        <w:t>Program on website: April</w:t>
-      </w:r>
-      <w:r>
-        <w:rPr>
-          <w:rFonts w:hint="eastAsia" w:ascii="Arial" w:hAnsi="Arial" w:eastAsia="宋体" w:cs="Arial"/>
-          <w:b w:val="0"/>
-          <w:bCs w:val="0"/>
-          <w:color w:val="000000"/>
-          <w:sz w:val="21"/>
-          <w:szCs w:val="21"/>
-          <w:shd w:val="clear" w:fill="auto"/>
-          <w:lang w:val="en-US" w:eastAsia="zh-CN"/>
-        </w:rPr>
-        <w:t xml:space="preserve"> </w:t>
-      </w:r>
-      <w:r>
-        <w:rPr>
-          <w:rFonts w:ascii="Arial" w:hAnsi="Arial" w:eastAsia="Arial MT" w:cs="Arial"/>
-          <w:b w:val="0"/>
-          <w:bCs w:val="0"/>
-          <w:color w:val="000000"/>
-          <w:sz w:val="21"/>
-          <w:szCs w:val="21"/>
-          <w:shd w:val="clear" w:fill="auto"/>
-        </w:rPr>
-        <w:t>1, 20</w:t>
-      </w:r>
-      <w:r>
-        <w:rPr>
-          <w:rFonts w:ascii="Arial" w:hAnsi="Arial" w:eastAsia="宋体" w:cs="Arial"/>
-          <w:b w:val="0"/>
-          <w:bCs w:val="0"/>
-          <w:color w:val="000000"/>
-          <w:sz w:val="21"/>
-          <w:szCs w:val="21"/>
-          <w:shd w:val="clear" w:fill="auto"/>
-          <w:lang w:val="en-US" w:eastAsia="zh-CN"/>
-        </w:rPr>
-        <w:t>27.</w:t>
-      </w:r>
+          <w:rFonts w:ascii="Arial" w:hAnsi="Arial" w:eastAsia="Arial-BoldMT" w:cs="Arial"/>
+          <w:b w:val="0"/>
+          <w:bCs w:val="0"/>
+          <w:color w:val="000000"/>
+          <w:sz w:val="21"/>
+          <w:szCs w:val="21"/>
+          <w:highlight w:val="none"/>
+          <w:shd w:val="clear" w:fill="auto"/>
+        </w:rPr>
+      </w:pPr>
     </w:p>
     <w:p>
       <w:pPr>
@@ -3539,16 +3711,21 @@
         <w:jc w:val="both"/>
         <w:textAlignment w:val="auto"/>
         <w:rPr>
+          <w:color w:val="000000"/>
+        </w:rPr>
+      </w:pPr>
+      <w:r>
+        <w:rPr>
           <w:rFonts w:ascii="Arial" w:hAnsi="Arial" w:eastAsia="Arial-BoldMT" w:cs="Arial"/>
-          <w:b w:val="0"/>
-          <w:bCs w:val="0"/>
-          <w:color w:val="000000"/>
-          <w:sz w:val="21"/>
-          <w:szCs w:val="21"/>
-          <w:highlight w:val="none"/>
-          <w:shd w:val="clear" w:fill="auto"/>
-        </w:rPr>
-      </w:pPr>
+          <w:b/>
+          <w:bCs/>
+          <w:color w:val="000000"/>
+          <w:sz w:val="21"/>
+          <w:szCs w:val="21"/>
+          <w:shd w:val="clear" w:fill="auto"/>
+        </w:rPr>
+        <w:t>VENDORS</w:t>
+      </w:r>
     </w:p>
     <w:p>
       <w:pPr>
@@ -3568,15 +3745,15 @@
       </w:pPr>
       <w:r>
         <w:rPr>
-          <w:rFonts w:ascii="Arial" w:hAnsi="Arial" w:eastAsia="Arial-BoldMT" w:cs="Arial"/>
-          <w:b/>
-          <w:bCs/>
-          <w:color w:val="000000"/>
-          <w:sz w:val="21"/>
-          <w:szCs w:val="21"/>
-          <w:shd w:val="clear" w:fill="auto"/>
-        </w:rPr>
-        <w:t>VENDORS</w:t>
+          <w:rFonts w:ascii="Arial" w:hAnsi="Arial" w:eastAsia="Times New Roman PS MT" w:cs="Arial"/>
+          <w:b w:val="0"/>
+          <w:bCs w:val="0"/>
+          <w:color w:val="000000"/>
+          <w:sz w:val="21"/>
+          <w:szCs w:val="21"/>
+          <w:shd w:val="clear" w:fill="auto"/>
+        </w:rPr>
+        <w:t>There will be a limited number of tables available to distribute fliers or pamphlets and sell books, CDs, and other materials. This service is complementary.</w:t>
       </w:r>
     </w:p>
     <w:p>
@@ -3592,21 +3769,16 @@
         <w:jc w:val="both"/>
         <w:textAlignment w:val="auto"/>
         <w:rPr>
-          <w:color w:val="000000"/>
-        </w:rPr>
-      </w:pPr>
-      <w:r>
-        <w:rPr>
-          <w:rFonts w:ascii="Arial" w:hAnsi="Arial" w:eastAsia="Times New Roman PS MT" w:cs="Arial"/>
-          <w:b w:val="0"/>
-          <w:bCs w:val="0"/>
-          <w:color w:val="000000"/>
-          <w:sz w:val="21"/>
-          <w:szCs w:val="21"/>
-          <w:shd w:val="clear" w:fill="auto"/>
-        </w:rPr>
-        <w:t>There will be a limited number of tables available to distribute fliers or pamphlets and sell books, CDs, and other materials. This service is complementary.</w:t>
-      </w:r>
+          <w:rFonts w:ascii="Arial" w:hAnsi="Arial" w:eastAsia="Arial-BoldMT" w:cs="Arial"/>
+          <w:b w:val="0"/>
+          <w:bCs w:val="0"/>
+          <w:color w:val="000000"/>
+          <w:sz w:val="21"/>
+          <w:szCs w:val="21"/>
+          <w:highlight w:val="none"/>
+          <w:shd w:val="clear" w:fill="auto"/>
+        </w:rPr>
+      </w:pPr>
     </w:p>
     <w:p>
       <w:pPr>
@@ -3621,16 +3793,22 @@
         <w:jc w:val="both"/>
         <w:textAlignment w:val="auto"/>
         <w:rPr>
-          <w:rFonts w:ascii="Arial" w:hAnsi="Arial" w:eastAsia="Arial-BoldMT" w:cs="Arial"/>
-          <w:b w:val="0"/>
-          <w:bCs w:val="0"/>
-          <w:color w:val="000000"/>
-          <w:sz w:val="21"/>
-          <w:szCs w:val="21"/>
-          <w:highlight w:val="none"/>
-          <w:shd w:val="clear" w:fill="auto"/>
-        </w:rPr>
-      </w:pPr>
+          <w:color w:val="000000"/>
+        </w:rPr>
+      </w:pPr>
+      <w:r>
+        <w:rPr>
+          <w:rFonts w:ascii="Arial" w:hAnsi="Arial" w:eastAsia="宋体" w:cs="Arial"/>
+          <w:b/>
+          <w:bCs/>
+          <w:color w:val="000000"/>
+          <w:sz w:val="21"/>
+          <w:szCs w:val="21"/>
+          <w:shd w:val="clear" w:fill="auto"/>
+          <w:lang w:val="en-US" w:eastAsia="zh-CN"/>
+        </w:rPr>
+        <w:t>LOGISTICS</w:t>
+      </w:r>
     </w:p>
     <w:p>
       <w:pPr>
@@ -3645,21 +3823,418 @@
         <w:jc w:val="both"/>
         <w:textAlignment w:val="auto"/>
         <w:rPr>
-          <w:color w:val="000000"/>
-        </w:rPr>
-      </w:pPr>
-      <w:r>
-        <w:rPr>
-          <w:rFonts w:ascii="Arial" w:hAnsi="Arial" w:eastAsia="宋体" w:cs="Arial"/>
-          <w:b/>
-          <w:bCs/>
-          <w:color w:val="000000"/>
-          <w:sz w:val="21"/>
-          <w:szCs w:val="21"/>
-          <w:shd w:val="clear" w:fill="auto"/>
-          <w:lang w:val="en-US" w:eastAsia="zh-CN"/>
-        </w:rPr>
-        <w:t>LOGISTICS</w:t>
+          <w:rFonts w:ascii="Arial" w:hAnsi="Arial" w:eastAsia="宋体" w:cs="Arial"/>
+          <w:b w:val="0"/>
+          <w:bCs w:val="0"/>
+          <w:color w:val="000000"/>
+          <w:sz w:val="21"/>
+          <w:szCs w:val="21"/>
+          <w:shd w:val="clear" w:fill="auto"/>
+          <w:lang w:val="en-US" w:eastAsia="zh-CN"/>
+        </w:rPr>
+      </w:pPr>
+      <w:r>
+        <w:rPr>
+          <w:rFonts w:ascii="Arial" w:hAnsi="Arial" w:eastAsia="宋体" w:cs="Arial"/>
+          <w:b w:val="0"/>
+          <w:bCs w:val="0"/>
+          <w:color w:val="000000"/>
+          <w:sz w:val="21"/>
+          <w:szCs w:val="21"/>
+          <w:shd w:val="clear" w:fill="auto"/>
+          <w:lang w:val="en-US" w:eastAsia="zh-CN"/>
+        </w:rPr>
+        <w:t>After arrival in China, ideally at Yaoqiang Airport</w:t>
+      </w:r>
+      <w:r>
+        <w:rPr>
+          <w:rFonts w:ascii="Arial" w:hAnsi="Arial" w:cs="Arial"/>
+          <w:b w:val="0"/>
+          <w:bCs w:val="0"/>
+          <w:color w:val="000000"/>
+          <w:sz w:val="21"/>
+          <w:szCs w:val="21"/>
+          <w:shd w:val="clear" w:fill="auto"/>
+          <w:lang w:val="en-US" w:eastAsia="zh-CN"/>
+        </w:rPr>
+        <w:t xml:space="preserve">遥墙机场 </w:t>
+      </w:r>
+      <w:r>
+        <w:rPr>
+          <w:rFonts w:ascii="Arial" w:hAnsi="Arial" w:eastAsia="宋体" w:cs="Arial"/>
+          <w:b w:val="0"/>
+          <w:bCs w:val="0"/>
+          <w:color w:val="000000"/>
+          <w:sz w:val="21"/>
+          <w:szCs w:val="21"/>
+          <w:shd w:val="clear" w:fill="auto"/>
+          <w:lang w:val="en-US" w:eastAsia="zh-CN"/>
+        </w:rPr>
+        <w:t>in Jinan, take local transport (airport bus or train if coming from another city) to the High-speed Railway Station named Jinan xizhan</w:t>
+      </w:r>
+      <w:r>
+        <w:rPr>
+          <w:rFonts w:hint="eastAsia" w:ascii="宋体" w:hAnsi="宋体" w:cs="宋体"/>
+          <w:b w:val="0"/>
+          <w:bCs w:val="0"/>
+          <w:color w:val="000000"/>
+          <w:sz w:val="21"/>
+          <w:szCs w:val="21"/>
+          <w:shd w:val="clear" w:fill="auto"/>
+          <w:lang w:val="en-US" w:eastAsia="zh-CN"/>
+        </w:rPr>
+        <w:t>济南西站</w:t>
+      </w:r>
+      <w:r>
+        <w:rPr>
+          <w:rFonts w:ascii="Arial" w:hAnsi="Arial" w:eastAsia="宋体" w:cs="Arial"/>
+          <w:b w:val="0"/>
+          <w:bCs w:val="0"/>
+          <w:color w:val="000000"/>
+          <w:sz w:val="21"/>
+          <w:szCs w:val="21"/>
+          <w:shd w:val="clear" w:fill="auto"/>
+          <w:lang w:val="en-US" w:eastAsia="zh-CN"/>
+        </w:rPr>
+        <w:t>. From here take the Metro Line 1</w:t>
+      </w:r>
+      <w:r>
+        <w:rPr>
+          <w:rFonts w:hint="eastAsia" w:ascii="宋体" w:hAnsi="宋体" w:cs="宋体"/>
+          <w:b w:val="0"/>
+          <w:bCs w:val="0"/>
+          <w:color w:val="000000"/>
+          <w:sz w:val="21"/>
+          <w:szCs w:val="21"/>
+          <w:shd w:val="clear" w:fill="auto"/>
+          <w:lang w:val="en-US" w:eastAsia="zh-CN"/>
+        </w:rPr>
+        <w:t>地铁一号线</w:t>
+      </w:r>
+      <w:r>
+        <w:rPr>
+          <w:rFonts w:ascii="Arial" w:hAnsi="Arial" w:cs="Arial"/>
+          <w:b w:val="0"/>
+          <w:bCs w:val="0"/>
+          <w:color w:val="000000"/>
+          <w:sz w:val="21"/>
+          <w:szCs w:val="21"/>
+          <w:shd w:val="clear" w:fill="auto"/>
+          <w:lang w:val="en-US" w:eastAsia="zh-CN"/>
+        </w:rPr>
+        <w:t xml:space="preserve"> </w:t>
+      </w:r>
+      <w:r>
+        <w:rPr>
+          <w:rFonts w:ascii="Arial" w:hAnsi="Arial" w:eastAsia="宋体" w:cs="Arial"/>
+          <w:b w:val="0"/>
+          <w:bCs w:val="0"/>
+          <w:color w:val="000000"/>
+          <w:sz w:val="21"/>
+          <w:szCs w:val="21"/>
+          <w:shd w:val="clear" w:fill="auto"/>
+          <w:lang w:val="en-US" w:eastAsia="zh-CN"/>
+        </w:rPr>
+        <w:t xml:space="preserve">to </w:t>
+      </w:r>
+      <w:r>
+        <w:rPr>
+          <w:rFonts w:hint="eastAsia" w:ascii="Arial" w:hAnsi="Arial" w:eastAsia="宋体" w:cs="Arial"/>
+          <w:b w:val="0"/>
+          <w:bCs w:val="0"/>
+          <w:color w:val="000000"/>
+          <w:sz w:val="21"/>
+          <w:szCs w:val="21"/>
+          <w:shd w:val="clear" w:fill="auto"/>
+          <w:lang w:val="en-US" w:eastAsia="zh-CN"/>
+        </w:rPr>
+        <w:t>Gongyanyuan</w:t>
+      </w:r>
+      <w:r>
+        <w:rPr>
+          <w:rFonts w:ascii="Arial" w:hAnsi="Arial" w:eastAsia="宋体" w:cs="Arial"/>
+          <w:b w:val="0"/>
+          <w:bCs w:val="0"/>
+          <w:color w:val="000000"/>
+          <w:sz w:val="21"/>
+          <w:szCs w:val="21"/>
+          <w:shd w:val="clear" w:fill="auto"/>
+          <w:lang w:val="en-US" w:eastAsia="zh-CN"/>
+        </w:rPr>
+        <w:t xml:space="preserve"> Station</w:t>
+      </w:r>
+      <w:r>
+        <w:rPr>
+          <w:rFonts w:hint="eastAsia" w:ascii="宋体" w:hAnsi="宋体" w:cs="宋体"/>
+          <w:b w:val="0"/>
+          <w:bCs w:val="0"/>
+          <w:color w:val="000000"/>
+          <w:sz w:val="21"/>
+          <w:szCs w:val="21"/>
+          <w:shd w:val="clear" w:fill="auto"/>
+          <w:lang w:val="en-US" w:eastAsia="zh-CN"/>
+        </w:rPr>
+        <w:t>工研院站</w:t>
+      </w:r>
+      <w:r>
+        <w:rPr>
+          <w:rFonts w:ascii="Arial" w:hAnsi="Arial" w:eastAsia="宋体" w:cs="Arial"/>
+          <w:b w:val="0"/>
+          <w:bCs w:val="0"/>
+          <w:color w:val="000000"/>
+          <w:sz w:val="21"/>
+          <w:szCs w:val="21"/>
+          <w:shd w:val="clear" w:fill="auto"/>
+          <w:lang w:val="en-US" w:eastAsia="zh-CN"/>
+        </w:rPr>
+        <w:t>, then use a taxi to the</w:t>
+      </w:r>
+      <w:r>
+        <w:rPr>
+          <w:rFonts w:hint="eastAsia" w:ascii="Arial" w:hAnsi="Arial" w:eastAsia="宋体" w:cs="Arial"/>
+          <w:b w:val="0"/>
+          <w:bCs w:val="0"/>
+          <w:color w:val="000000"/>
+          <w:sz w:val="21"/>
+          <w:szCs w:val="21"/>
+          <w:shd w:val="clear" w:fill="auto"/>
+          <w:lang w:val="en-US" w:eastAsia="zh-CN"/>
+        </w:rPr>
+        <w:t xml:space="preserve"> </w:t>
+      </w:r>
+      <w:r>
+        <w:rPr>
+          <w:rFonts w:ascii="Arial" w:hAnsi="Arial" w:eastAsia="宋体" w:cs="Arial"/>
+          <w:b w:val="0"/>
+          <w:bCs w:val="0"/>
+          <w:color w:val="000000"/>
+          <w:sz w:val="21"/>
+          <w:szCs w:val="21"/>
+          <w:shd w:val="clear" w:fill="auto"/>
+          <w:lang w:val="en-US" w:eastAsia="zh-CN"/>
+        </w:rPr>
+        <w:t xml:space="preserve">Wufengge Hotel </w:t>
+      </w:r>
+      <w:r>
+        <w:rPr>
+          <w:rFonts w:hint="eastAsia" w:ascii="宋体" w:hAnsi="宋体" w:cs="宋体"/>
+          <w:b w:val="0"/>
+          <w:bCs w:val="0"/>
+          <w:color w:val="000000"/>
+          <w:sz w:val="21"/>
+          <w:szCs w:val="21"/>
+          <w:shd w:val="clear" w:fill="auto"/>
+          <w:lang w:val="en-US" w:eastAsia="zh-CN"/>
+        </w:rPr>
+        <w:t>五峰阁宾馆</w:t>
+      </w:r>
+      <w:r>
+        <w:rPr>
+          <w:rFonts w:ascii="Arial" w:hAnsi="Arial" w:cs="Arial"/>
+          <w:b w:val="0"/>
+          <w:bCs w:val="0"/>
+          <w:color w:val="000000"/>
+          <w:sz w:val="21"/>
+          <w:szCs w:val="21"/>
+          <w:shd w:val="clear" w:fill="auto"/>
+          <w:lang w:val="en-US" w:eastAsia="zh-CN"/>
+        </w:rPr>
+        <w:t>(the price is about US</w:t>
+      </w:r>
+      <w:r>
+        <w:rPr>
+          <w:rFonts w:hint="eastAsia" w:ascii="Arial" w:hAnsi="Arial" w:cs="Arial"/>
+          <w:b w:val="0"/>
+          <w:bCs w:val="0"/>
+          <w:color w:val="000000"/>
+          <w:sz w:val="21"/>
+          <w:szCs w:val="21"/>
+          <w:shd w:val="clear" w:fill="auto"/>
+          <w:lang w:val="en-US" w:eastAsia="zh-CN"/>
+        </w:rPr>
+        <w:t xml:space="preserve"> </w:t>
+      </w:r>
+      <w:r>
+        <w:rPr>
+          <w:rFonts w:ascii="Arial" w:hAnsi="Arial" w:cs="Arial"/>
+          <w:b w:val="0"/>
+          <w:bCs w:val="0"/>
+          <w:color w:val="000000"/>
+          <w:sz w:val="21"/>
+          <w:szCs w:val="21"/>
+          <w:shd w:val="clear" w:fill="auto"/>
+          <w:lang w:val="en-US" w:eastAsia="zh-CN"/>
+        </w:rPr>
+        <w:t>$4)</w:t>
+      </w:r>
+      <w:r>
+        <w:rPr>
+          <w:rFonts w:ascii="Arial" w:hAnsi="Arial" w:eastAsia="宋体" w:cs="Arial"/>
+          <w:b w:val="0"/>
+          <w:bCs w:val="0"/>
+          <w:color w:val="000000"/>
+          <w:sz w:val="21"/>
+          <w:szCs w:val="21"/>
+          <w:shd w:val="clear" w:fill="auto"/>
+          <w:lang w:val="en-US" w:eastAsia="zh-CN"/>
+        </w:rPr>
+        <w:t xml:space="preserve">. </w:t>
+      </w:r>
+      <w:r>
+        <w:rPr>
+          <w:rFonts w:hint="eastAsia" w:ascii="Arial" w:hAnsi="Arial" w:eastAsia="宋体" w:cs="Arial"/>
+          <w:b w:val="0"/>
+          <w:bCs w:val="0"/>
+          <w:color w:val="000000"/>
+          <w:sz w:val="21"/>
+          <w:szCs w:val="21"/>
+          <w:shd w:val="clear" w:fill="auto"/>
+          <w:lang w:val="en-US" w:eastAsia="zh-CN"/>
+        </w:rPr>
+        <w:t>At</w:t>
+      </w:r>
+      <w:r>
+        <w:rPr>
+          <w:rFonts w:ascii="Arial" w:hAnsi="Arial" w:eastAsia="宋体" w:cs="Arial"/>
+          <w:b w:val="0"/>
+          <w:bCs w:val="0"/>
+          <w:color w:val="000000"/>
+          <w:sz w:val="21"/>
+          <w:szCs w:val="21"/>
+          <w:shd w:val="clear" w:fill="auto"/>
+          <w:lang w:val="en-US" w:eastAsia="zh-CN"/>
+        </w:rPr>
+        <w:t xml:space="preserve"> 18:00 on May 25, we will also provide </w:t>
+      </w:r>
+      <w:r>
+        <w:rPr>
+          <w:rFonts w:hint="eastAsia" w:ascii="Arial" w:hAnsi="Arial" w:eastAsia="宋体" w:cs="Arial"/>
+          <w:b w:val="0"/>
+          <w:bCs w:val="0"/>
+          <w:color w:val="000000"/>
+          <w:sz w:val="21"/>
+          <w:szCs w:val="21"/>
+          <w:shd w:val="clear" w:fill="auto"/>
+          <w:lang w:val="en-US" w:eastAsia="zh-CN"/>
+        </w:rPr>
+        <w:t xml:space="preserve">a </w:t>
+      </w:r>
+      <w:r>
+        <w:rPr>
+          <w:rFonts w:ascii="Arial" w:hAnsi="Arial" w:eastAsia="宋体" w:cs="Arial"/>
+          <w:b w:val="0"/>
+          <w:bCs w:val="0"/>
+          <w:color w:val="000000"/>
+          <w:sz w:val="21"/>
+          <w:szCs w:val="21"/>
+          <w:shd w:val="clear" w:fill="auto"/>
+          <w:lang w:val="en-US" w:eastAsia="zh-CN"/>
+        </w:rPr>
+        <w:t xml:space="preserve">shuttle bus from the </w:t>
+      </w:r>
+      <w:r>
+        <w:rPr>
+          <w:rFonts w:hint="eastAsia" w:ascii="Arial" w:hAnsi="Arial" w:eastAsia="宋体" w:cs="Arial"/>
+          <w:b w:val="0"/>
+          <w:bCs w:val="0"/>
+          <w:color w:val="000000"/>
+          <w:sz w:val="21"/>
+          <w:szCs w:val="21"/>
+          <w:shd w:val="clear" w:fill="auto"/>
+          <w:lang w:val="en-US" w:eastAsia="zh-CN"/>
+        </w:rPr>
+        <w:t xml:space="preserve">Subway </w:t>
+      </w:r>
+      <w:r>
+        <w:rPr>
+          <w:rFonts w:ascii="Arial" w:hAnsi="Arial" w:eastAsia="宋体" w:cs="Arial"/>
+          <w:b w:val="0"/>
+          <w:bCs w:val="0"/>
+          <w:color w:val="000000"/>
+          <w:sz w:val="21"/>
+          <w:szCs w:val="21"/>
+          <w:shd w:val="clear" w:fill="auto"/>
+          <w:lang w:val="en-US" w:eastAsia="zh-CN"/>
+        </w:rPr>
+        <w:t>Station to the Hotel</w:t>
+      </w:r>
+      <w:r>
+        <w:rPr>
+          <w:rFonts w:hint="eastAsia" w:ascii="Arial" w:hAnsi="Arial" w:eastAsia="宋体" w:cs="Arial"/>
+          <w:b w:val="0"/>
+          <w:bCs w:val="0"/>
+          <w:color w:val="000000"/>
+          <w:sz w:val="21"/>
+          <w:szCs w:val="21"/>
+          <w:shd w:val="clear" w:fill="auto"/>
+          <w:lang w:val="en-US" w:eastAsia="zh-CN"/>
+        </w:rPr>
+        <w:t>, which will wait at Exit B of Gongyanyuan</w:t>
+      </w:r>
+      <w:r>
+        <w:rPr>
+          <w:rFonts w:ascii="Arial" w:hAnsi="Arial" w:eastAsia="宋体" w:cs="Arial"/>
+          <w:b w:val="0"/>
+          <w:bCs w:val="0"/>
+          <w:color w:val="000000"/>
+          <w:sz w:val="21"/>
+          <w:szCs w:val="21"/>
+          <w:shd w:val="clear" w:fill="auto"/>
+          <w:lang w:val="en-US" w:eastAsia="zh-CN"/>
+        </w:rPr>
+        <w:t xml:space="preserve"> Station</w:t>
+      </w:r>
+      <w:r>
+        <w:rPr>
+          <w:rFonts w:hint="eastAsia" w:ascii="宋体" w:hAnsi="宋体" w:cs="宋体"/>
+          <w:b w:val="0"/>
+          <w:bCs w:val="0"/>
+          <w:color w:val="000000"/>
+          <w:sz w:val="21"/>
+          <w:szCs w:val="21"/>
+          <w:shd w:val="clear" w:fill="auto"/>
+          <w:lang w:val="en-US" w:eastAsia="zh-CN"/>
+        </w:rPr>
+        <w:t>工研院站</w:t>
+      </w:r>
+      <w:r>
+        <w:rPr>
+          <w:rFonts w:ascii="Times New Roman" w:hAnsi="Times New Roman" w:cs="Times New Roman"/>
+          <w:b w:val="0"/>
+          <w:bCs w:val="0"/>
+          <w:color w:val="000000"/>
+          <w:sz w:val="21"/>
+          <w:szCs w:val="21"/>
+          <w:shd w:val="clear" w:fill="auto"/>
+          <w:lang w:val="en-US" w:eastAsia="zh-CN"/>
+        </w:rPr>
+        <w:t>B</w:t>
+      </w:r>
+      <w:r>
+        <w:rPr>
+          <w:rFonts w:hint="eastAsia" w:ascii="宋体" w:hAnsi="宋体" w:cs="宋体"/>
+          <w:b w:val="0"/>
+          <w:bCs w:val="0"/>
+          <w:color w:val="000000"/>
+          <w:sz w:val="21"/>
+          <w:szCs w:val="21"/>
+          <w:shd w:val="clear" w:fill="auto"/>
+          <w:lang w:val="en-US" w:eastAsia="zh-CN"/>
+        </w:rPr>
+        <w:t>出口</w:t>
+      </w:r>
+      <w:r>
+        <w:rPr>
+          <w:rFonts w:ascii="Arial" w:hAnsi="Arial" w:eastAsia="宋体" w:cs="Arial"/>
+          <w:b w:val="0"/>
+          <w:bCs w:val="0"/>
+          <w:color w:val="000000"/>
+          <w:sz w:val="21"/>
+          <w:szCs w:val="21"/>
+          <w:shd w:val="clear" w:fill="auto"/>
+          <w:lang w:val="en-US" w:eastAsia="zh-CN"/>
+        </w:rPr>
+        <w:t>.</w:t>
       </w:r>
     </w:p>
     <w:p>
@@ -3685,424 +4260,6 @@
           <w:lang w:val="en-US" w:eastAsia="zh-CN"/>
         </w:rPr>
       </w:pPr>
-      <w:r>
-        <w:rPr>
-          <w:rFonts w:ascii="Arial" w:hAnsi="Arial" w:eastAsia="宋体" w:cs="Arial"/>
-          <w:b w:val="0"/>
-          <w:bCs w:val="0"/>
-          <w:color w:val="000000"/>
-          <w:sz w:val="21"/>
-          <w:szCs w:val="21"/>
-          <w:shd w:val="clear" w:fill="auto"/>
-          <w:lang w:val="en-US" w:eastAsia="zh-CN"/>
-        </w:rPr>
-        <w:t>After arrival in China, ideally at Yaoqiang Airport</w:t>
-      </w:r>
-      <w:r>
-        <w:rPr>
-          <w:rFonts w:ascii="Arial" w:hAnsi="Arial" w:cs="Arial"/>
-          <w:b w:val="0"/>
-          <w:bCs w:val="0"/>
-          <w:color w:val="000000"/>
-          <w:sz w:val="21"/>
-          <w:szCs w:val="21"/>
-          <w:shd w:val="clear" w:fill="auto"/>
-          <w:lang w:val="en-US" w:eastAsia="zh-CN"/>
-        </w:rPr>
-        <w:t xml:space="preserve">遥墙机场 </w:t>
-      </w:r>
-      <w:r>
-        <w:rPr>
-          <w:rFonts w:ascii="Arial" w:hAnsi="Arial" w:eastAsia="宋体" w:cs="Arial"/>
-          <w:b w:val="0"/>
-          <w:bCs w:val="0"/>
-          <w:color w:val="000000"/>
-          <w:sz w:val="21"/>
-          <w:szCs w:val="21"/>
-          <w:shd w:val="clear" w:fill="auto"/>
-          <w:lang w:val="en-US" w:eastAsia="zh-CN"/>
-        </w:rPr>
-        <w:t>in Jinan, take local transport (airport bus or train if coming from another city) to the High-speed Railway Station named Jinan xizhan</w:t>
-      </w:r>
-      <w:r>
-        <w:rPr>
-          <w:rFonts w:hint="eastAsia" w:ascii="宋体" w:hAnsi="宋体" w:cs="宋体"/>
-          <w:b w:val="0"/>
-          <w:bCs w:val="0"/>
-          <w:color w:val="000000"/>
-          <w:sz w:val="21"/>
-          <w:szCs w:val="21"/>
-          <w:shd w:val="clear" w:fill="auto"/>
-          <w:lang w:val="en-US" w:eastAsia="zh-CN"/>
-        </w:rPr>
-        <w:t>济南西站</w:t>
-      </w:r>
-      <w:r>
-        <w:rPr>
-          <w:rFonts w:ascii="Arial" w:hAnsi="Arial" w:eastAsia="宋体" w:cs="Arial"/>
-          <w:b w:val="0"/>
-          <w:bCs w:val="0"/>
-          <w:color w:val="000000"/>
-          <w:sz w:val="21"/>
-          <w:szCs w:val="21"/>
-          <w:shd w:val="clear" w:fill="auto"/>
-          <w:lang w:val="en-US" w:eastAsia="zh-CN"/>
-        </w:rPr>
-        <w:t>. From here take the Metro Line 1</w:t>
-      </w:r>
-      <w:r>
-        <w:rPr>
-          <w:rFonts w:hint="eastAsia" w:ascii="宋体" w:hAnsi="宋体" w:cs="宋体"/>
-          <w:b w:val="0"/>
-          <w:bCs w:val="0"/>
-          <w:color w:val="000000"/>
-          <w:sz w:val="21"/>
-          <w:szCs w:val="21"/>
-          <w:shd w:val="clear" w:fill="auto"/>
-          <w:lang w:val="en-US" w:eastAsia="zh-CN"/>
-        </w:rPr>
-        <w:t>地铁一号线</w:t>
-      </w:r>
-      <w:r>
-        <w:rPr>
-          <w:rFonts w:ascii="Arial" w:hAnsi="Arial" w:cs="Arial"/>
-          <w:b w:val="0"/>
-          <w:bCs w:val="0"/>
-          <w:color w:val="000000"/>
-          <w:sz w:val="21"/>
-          <w:szCs w:val="21"/>
-          <w:shd w:val="clear" w:fill="auto"/>
-          <w:lang w:val="en-US" w:eastAsia="zh-CN"/>
-        </w:rPr>
-        <w:t xml:space="preserve"> </w:t>
-      </w:r>
-      <w:r>
-        <w:rPr>
-          <w:rFonts w:ascii="Arial" w:hAnsi="Arial" w:eastAsia="宋体" w:cs="Arial"/>
-          <w:b w:val="0"/>
-          <w:bCs w:val="0"/>
-          <w:color w:val="000000"/>
-          <w:sz w:val="21"/>
-          <w:szCs w:val="21"/>
-          <w:shd w:val="clear" w:fill="auto"/>
-          <w:lang w:val="en-US" w:eastAsia="zh-CN"/>
-        </w:rPr>
-        <w:t xml:space="preserve">to </w:t>
-      </w:r>
-      <w:r>
-        <w:rPr>
-          <w:rFonts w:hint="eastAsia" w:ascii="Arial" w:hAnsi="Arial" w:eastAsia="宋体" w:cs="Arial"/>
-          <w:b w:val="0"/>
-          <w:bCs w:val="0"/>
-          <w:color w:val="000000"/>
-          <w:sz w:val="21"/>
-          <w:szCs w:val="21"/>
-          <w:shd w:val="clear" w:fill="auto"/>
-          <w:lang w:val="en-US" w:eastAsia="zh-CN"/>
-        </w:rPr>
-        <w:t>Gongyanyuan</w:t>
-      </w:r>
-      <w:r>
-        <w:rPr>
-          <w:rFonts w:ascii="Arial" w:hAnsi="Arial" w:eastAsia="宋体" w:cs="Arial"/>
-          <w:b w:val="0"/>
-          <w:bCs w:val="0"/>
-          <w:color w:val="000000"/>
-          <w:sz w:val="21"/>
-          <w:szCs w:val="21"/>
-          <w:shd w:val="clear" w:fill="auto"/>
-          <w:lang w:val="en-US" w:eastAsia="zh-CN"/>
-        </w:rPr>
-        <w:t xml:space="preserve"> Station</w:t>
-      </w:r>
-      <w:r>
-        <w:rPr>
-          <w:rFonts w:hint="eastAsia" w:ascii="宋体" w:hAnsi="宋体" w:cs="宋体"/>
-          <w:b w:val="0"/>
-          <w:bCs w:val="0"/>
-          <w:color w:val="000000"/>
-          <w:sz w:val="21"/>
-          <w:szCs w:val="21"/>
-          <w:shd w:val="clear" w:fill="auto"/>
-          <w:lang w:val="en-US" w:eastAsia="zh-CN"/>
-        </w:rPr>
-        <w:t>工研院站</w:t>
-      </w:r>
-      <w:r>
-        <w:rPr>
-          <w:rFonts w:ascii="Arial" w:hAnsi="Arial" w:eastAsia="宋体" w:cs="Arial"/>
-          <w:b w:val="0"/>
-          <w:bCs w:val="0"/>
-          <w:color w:val="000000"/>
-          <w:sz w:val="21"/>
-          <w:szCs w:val="21"/>
-          <w:shd w:val="clear" w:fill="auto"/>
-          <w:lang w:val="en-US" w:eastAsia="zh-CN"/>
-        </w:rPr>
-        <w:t>, then use a taxi to the</w:t>
-      </w:r>
-      <w:r>
-        <w:rPr>
-          <w:rFonts w:hint="eastAsia" w:ascii="Arial" w:hAnsi="Arial" w:eastAsia="宋体" w:cs="Arial"/>
-          <w:b w:val="0"/>
-          <w:bCs w:val="0"/>
-          <w:color w:val="000000"/>
-          <w:sz w:val="21"/>
-          <w:szCs w:val="21"/>
-          <w:shd w:val="clear" w:fill="auto"/>
-          <w:lang w:val="en-US" w:eastAsia="zh-CN"/>
-        </w:rPr>
-        <w:t xml:space="preserve"> </w:t>
-      </w:r>
-      <w:r>
-        <w:rPr>
-          <w:rFonts w:ascii="Arial" w:hAnsi="Arial" w:eastAsia="宋体" w:cs="Arial"/>
-          <w:b w:val="0"/>
-          <w:bCs w:val="0"/>
-          <w:color w:val="000000"/>
-          <w:sz w:val="21"/>
-          <w:szCs w:val="21"/>
-          <w:shd w:val="clear" w:fill="auto"/>
-          <w:lang w:val="en-US" w:eastAsia="zh-CN"/>
-        </w:rPr>
-        <w:t xml:space="preserve">Wufengge Hotel </w:t>
-      </w:r>
-      <w:r>
-        <w:rPr>
-          <w:rFonts w:hint="eastAsia" w:ascii="宋体" w:hAnsi="宋体" w:cs="宋体"/>
-          <w:b w:val="0"/>
-          <w:bCs w:val="0"/>
-          <w:color w:val="000000"/>
-          <w:sz w:val="21"/>
-          <w:szCs w:val="21"/>
-          <w:shd w:val="clear" w:fill="auto"/>
-          <w:lang w:val="en-US" w:eastAsia="zh-CN"/>
-        </w:rPr>
-        <w:t>五峰阁宾馆</w:t>
-      </w:r>
-      <w:r>
-        <w:rPr>
-          <w:rFonts w:ascii="Arial" w:hAnsi="Arial" w:cs="Arial"/>
-          <w:b w:val="0"/>
-          <w:bCs w:val="0"/>
-          <w:color w:val="000000"/>
-          <w:sz w:val="21"/>
-          <w:szCs w:val="21"/>
-          <w:shd w:val="clear" w:fill="auto"/>
-          <w:lang w:val="en-US" w:eastAsia="zh-CN"/>
-        </w:rPr>
-        <w:t>(the price is about US</w:t>
-      </w:r>
-      <w:r>
-        <w:rPr>
-          <w:rFonts w:hint="eastAsia" w:ascii="Arial" w:hAnsi="Arial" w:cs="Arial"/>
-          <w:b w:val="0"/>
-          <w:bCs w:val="0"/>
-          <w:color w:val="000000"/>
-          <w:sz w:val="21"/>
-          <w:szCs w:val="21"/>
-          <w:shd w:val="clear" w:fill="auto"/>
-          <w:lang w:val="en-US" w:eastAsia="zh-CN"/>
-        </w:rPr>
-        <w:t xml:space="preserve"> </w:t>
-      </w:r>
-      <w:r>
-        <w:rPr>
-          <w:rFonts w:ascii="Arial" w:hAnsi="Arial" w:cs="Arial"/>
-          <w:b w:val="0"/>
-          <w:bCs w:val="0"/>
-          <w:color w:val="000000"/>
-          <w:sz w:val="21"/>
-          <w:szCs w:val="21"/>
-          <w:shd w:val="clear" w:fill="auto"/>
-          <w:lang w:val="en-US" w:eastAsia="zh-CN"/>
-        </w:rPr>
-        <w:t>$4)</w:t>
-      </w:r>
-      <w:r>
-        <w:rPr>
-          <w:rFonts w:ascii="Arial" w:hAnsi="Arial" w:eastAsia="宋体" w:cs="Arial"/>
-          <w:b w:val="0"/>
-          <w:bCs w:val="0"/>
-          <w:color w:val="000000"/>
-          <w:sz w:val="21"/>
-          <w:szCs w:val="21"/>
-          <w:shd w:val="clear" w:fill="auto"/>
-          <w:lang w:val="en-US" w:eastAsia="zh-CN"/>
-        </w:rPr>
-        <w:t xml:space="preserve">. </w:t>
-      </w:r>
-      <w:r>
-        <w:rPr>
-          <w:rFonts w:hint="eastAsia" w:ascii="Arial" w:hAnsi="Arial" w:eastAsia="宋体" w:cs="Arial"/>
-          <w:b w:val="0"/>
-          <w:bCs w:val="0"/>
-          <w:color w:val="000000"/>
-          <w:sz w:val="21"/>
-          <w:szCs w:val="21"/>
-          <w:shd w:val="clear" w:fill="auto"/>
-          <w:lang w:val="en-US" w:eastAsia="zh-CN"/>
-        </w:rPr>
-        <w:t>At</w:t>
-      </w:r>
-      <w:r>
-        <w:rPr>
-          <w:rFonts w:ascii="Arial" w:hAnsi="Arial" w:eastAsia="宋体" w:cs="Arial"/>
-          <w:b w:val="0"/>
-          <w:bCs w:val="0"/>
-          <w:color w:val="000000"/>
-          <w:sz w:val="21"/>
-          <w:szCs w:val="21"/>
-          <w:shd w:val="clear" w:fill="auto"/>
-          <w:lang w:val="en-US" w:eastAsia="zh-CN"/>
-        </w:rPr>
-        <w:t xml:space="preserve"> 18:00 on May 25, we will also provide </w:t>
-      </w:r>
-      <w:r>
-        <w:rPr>
-          <w:rFonts w:hint="eastAsia" w:ascii="Arial" w:hAnsi="Arial" w:eastAsia="宋体" w:cs="Arial"/>
-          <w:b w:val="0"/>
-          <w:bCs w:val="0"/>
-          <w:color w:val="000000"/>
-          <w:sz w:val="21"/>
-          <w:szCs w:val="21"/>
-          <w:shd w:val="clear" w:fill="auto"/>
-          <w:lang w:val="en-US" w:eastAsia="zh-CN"/>
-        </w:rPr>
-        <w:t xml:space="preserve">a </w:t>
-      </w:r>
-      <w:r>
-        <w:rPr>
-          <w:rFonts w:ascii="Arial" w:hAnsi="Arial" w:eastAsia="宋体" w:cs="Arial"/>
-          <w:b w:val="0"/>
-          <w:bCs w:val="0"/>
-          <w:color w:val="000000"/>
-          <w:sz w:val="21"/>
-          <w:szCs w:val="21"/>
-          <w:shd w:val="clear" w:fill="auto"/>
-          <w:lang w:val="en-US" w:eastAsia="zh-CN"/>
-        </w:rPr>
-        <w:t xml:space="preserve">shuttle bus from the </w:t>
-      </w:r>
-      <w:r>
-        <w:rPr>
-          <w:rFonts w:hint="eastAsia" w:ascii="Arial" w:hAnsi="Arial" w:eastAsia="宋体" w:cs="Arial"/>
-          <w:b w:val="0"/>
-          <w:bCs w:val="0"/>
-          <w:color w:val="000000"/>
-          <w:sz w:val="21"/>
-          <w:szCs w:val="21"/>
-          <w:shd w:val="clear" w:fill="auto"/>
-          <w:lang w:val="en-US" w:eastAsia="zh-CN"/>
-        </w:rPr>
-        <w:t xml:space="preserve">Subway </w:t>
-      </w:r>
-      <w:r>
-        <w:rPr>
-          <w:rFonts w:ascii="Arial" w:hAnsi="Arial" w:eastAsia="宋体" w:cs="Arial"/>
-          <w:b w:val="0"/>
-          <w:bCs w:val="0"/>
-          <w:color w:val="000000"/>
-          <w:sz w:val="21"/>
-          <w:szCs w:val="21"/>
-          <w:shd w:val="clear" w:fill="auto"/>
-          <w:lang w:val="en-US" w:eastAsia="zh-CN"/>
-        </w:rPr>
-        <w:t>Sta</w:t>
-      </w:r>
-      <w:bookmarkStart w:id="2" w:name="_GoBack"/>
-      <w:bookmarkEnd w:id="2"/>
-      <w:r>
-        <w:rPr>
-          <w:rFonts w:ascii="Arial" w:hAnsi="Arial" w:eastAsia="宋体" w:cs="Arial"/>
-          <w:b w:val="0"/>
-          <w:bCs w:val="0"/>
-          <w:color w:val="000000"/>
-          <w:sz w:val="21"/>
-          <w:szCs w:val="21"/>
-          <w:shd w:val="clear" w:fill="auto"/>
-          <w:lang w:val="en-US" w:eastAsia="zh-CN"/>
-        </w:rPr>
-        <w:t>tion to the Hotel</w:t>
-      </w:r>
-      <w:r>
-        <w:rPr>
-          <w:rFonts w:hint="eastAsia" w:ascii="Arial" w:hAnsi="Arial" w:eastAsia="宋体" w:cs="Arial"/>
-          <w:b w:val="0"/>
-          <w:bCs w:val="0"/>
-          <w:color w:val="000000"/>
-          <w:sz w:val="21"/>
-          <w:szCs w:val="21"/>
-          <w:shd w:val="clear" w:fill="auto"/>
-          <w:lang w:val="en-US" w:eastAsia="zh-CN"/>
-        </w:rPr>
-        <w:t>, which will wait at Exit B of Gongyanyuan</w:t>
-      </w:r>
-      <w:r>
-        <w:rPr>
-          <w:rFonts w:ascii="Arial" w:hAnsi="Arial" w:eastAsia="宋体" w:cs="Arial"/>
-          <w:b w:val="0"/>
-          <w:bCs w:val="0"/>
-          <w:color w:val="000000"/>
-          <w:sz w:val="21"/>
-          <w:szCs w:val="21"/>
-          <w:shd w:val="clear" w:fill="auto"/>
-          <w:lang w:val="en-US" w:eastAsia="zh-CN"/>
-        </w:rPr>
-        <w:t xml:space="preserve"> Station</w:t>
-      </w:r>
-      <w:r>
-        <w:rPr>
-          <w:rFonts w:hint="eastAsia" w:ascii="宋体" w:hAnsi="宋体" w:cs="宋体"/>
-          <w:b w:val="0"/>
-          <w:bCs w:val="0"/>
-          <w:color w:val="000000"/>
-          <w:sz w:val="21"/>
-          <w:szCs w:val="21"/>
-          <w:shd w:val="clear" w:fill="auto"/>
-          <w:lang w:val="en-US" w:eastAsia="zh-CN"/>
-        </w:rPr>
-        <w:t>工研院站</w:t>
-      </w:r>
-      <w:r>
-        <w:rPr>
-          <w:rFonts w:ascii="Times New Roman" w:hAnsi="Times New Roman" w:cs="Times New Roman"/>
-          <w:b w:val="0"/>
-          <w:bCs w:val="0"/>
-          <w:color w:val="000000"/>
-          <w:sz w:val="21"/>
-          <w:szCs w:val="21"/>
-          <w:shd w:val="clear" w:fill="auto"/>
-          <w:lang w:val="en-US" w:eastAsia="zh-CN"/>
-        </w:rPr>
-        <w:t>B</w:t>
-      </w:r>
-      <w:r>
-        <w:rPr>
-          <w:rFonts w:hint="eastAsia" w:ascii="宋体" w:hAnsi="宋体" w:cs="宋体"/>
-          <w:b w:val="0"/>
-          <w:bCs w:val="0"/>
-          <w:color w:val="000000"/>
-          <w:sz w:val="21"/>
-          <w:szCs w:val="21"/>
-          <w:shd w:val="clear" w:fill="auto"/>
-          <w:lang w:val="en-US" w:eastAsia="zh-CN"/>
-        </w:rPr>
-        <w:t>出口</w:t>
-      </w:r>
-      <w:r>
-        <w:rPr>
-          <w:rFonts w:ascii="Arial" w:hAnsi="Arial" w:eastAsia="宋体" w:cs="Arial"/>
-          <w:b w:val="0"/>
-          <w:bCs w:val="0"/>
-          <w:color w:val="000000"/>
-          <w:sz w:val="21"/>
-          <w:szCs w:val="21"/>
-          <w:shd w:val="clear" w:fill="auto"/>
-          <w:lang w:val="en-US" w:eastAsia="zh-CN"/>
-        </w:rPr>
-        <w:t>.</w:t>
-      </w:r>
     </w:p>
     <w:p>
       <w:pPr>
@@ -4117,31 +4274,47 @@
         <w:jc w:val="both"/>
         <w:textAlignment w:val="auto"/>
         <w:rPr>
-          <w:rFonts w:ascii="Arial" w:hAnsi="Arial" w:eastAsia="宋体" w:cs="Arial"/>
-          <w:b w:val="0"/>
-          <w:bCs w:val="0"/>
-          <w:color w:val="000000"/>
-          <w:sz w:val="21"/>
-          <w:szCs w:val="21"/>
-          <w:shd w:val="clear" w:fill="auto"/>
-          <w:lang w:val="en-US" w:eastAsia="zh-CN"/>
-        </w:rPr>
-      </w:pPr>
-    </w:p>
-    <w:p>
-      <w:pPr>
-        <w:keepNext w:val="0"/>
-        <w:keepLines w:val="0"/>
-        <w:pageBreakBefore w:val="0"/>
-        <w:widowControl w:val="0"/>
-        <w:overflowPunct/>
-        <w:bidi w:val="0"/>
-        <w:snapToGrid/>
-        <w:spacing w:line="240" w:lineRule="auto"/>
-        <w:jc w:val="both"/>
-        <w:textAlignment w:val="auto"/>
-        <w:rPr>
-          <w:rFonts w:hint="default" w:ascii="Arial" w:hAnsi="Arial" w:eastAsia="宋体" w:cs="Arial"/>
+          <w:rFonts w:hint="eastAsia" w:ascii="Arial" w:hAnsi="Arial" w:eastAsia="宋体" w:cs="Arial"/>
+          <w:b w:val="0"/>
+          <w:bCs w:val="0"/>
+          <w:color w:val="auto"/>
+          <w:sz w:val="21"/>
+          <w:szCs w:val="21"/>
+          <w:shd w:val="clear" w:fill="auto"/>
+          <w:lang w:val="en-US" w:eastAsia="zh-CN"/>
+        </w:rPr>
+      </w:pPr>
+      <w:r>
+        <w:rPr>
+          <w:rFonts w:hint="eastAsia" w:ascii="Arial" w:hAnsi="Arial" w:eastAsia="宋体" w:cs="Arial"/>
+          <w:b w:val="0"/>
+          <w:bCs w:val="0"/>
+          <w:color w:val="000000"/>
+          <w:sz w:val="21"/>
+          <w:szCs w:val="21"/>
+          <w:shd w:val="clear" w:fill="auto"/>
+          <w:lang w:val="en-US" w:eastAsia="zh-CN"/>
+        </w:rPr>
+        <w:t xml:space="preserve">   </w:t>
+      </w:r>
+      <w:r>
+        <w:rPr>
+          <w:rFonts w:hint="eastAsia" w:ascii="Arial" w:hAnsi="Arial" w:eastAsia="宋体" w:cs="Arial"/>
+          <w:b w:val="0"/>
+          <w:bCs w:val="0"/>
+          <w:color w:val="auto"/>
+          <w:sz w:val="21"/>
+          <w:szCs w:val="21"/>
+          <w:shd w:val="clear" w:fill="auto"/>
+          <w:lang w:val="en-US" w:eastAsia="zh-CN"/>
+        </w:rPr>
+        <w:t xml:space="preserve"> NOTE: It is recommended to download the international version of TRIP App, DIDI App, Nihao China App, then register and bind a bank card or credit card on them, for taking the subway, buses, and taxis in China conveniently. However, it would be best to exchange some RMB upon entering China customs.</w:t>
+      </w:r>
+    </w:p>
+    <w:p>
+      <w:pPr>
+        <w:rPr>
+          <w:rFonts w:hint="eastAsia" w:ascii="Arial" w:hAnsi="Arial" w:eastAsia="宋体" w:cs="Arial"/>
           <w:b w:val="0"/>
           <w:bCs w:val="0"/>
           <w:color w:val="FF0000"/>
@@ -4156,57 +4329,14 @@
           <w:rFonts w:hint="eastAsia" w:ascii="Arial" w:hAnsi="Arial" w:eastAsia="宋体" w:cs="Arial"/>
           <w:b w:val="0"/>
           <w:bCs w:val="0"/>
-          <w:color w:val="000000"/>
-          <w:sz w:val="21"/>
-          <w:szCs w:val="21"/>
-          <w:shd w:val="clear" w:fill="auto"/>
-          <w:lang w:val="en-US" w:eastAsia="zh-CN"/>
-        </w:rPr>
-        <w:t xml:space="preserve">    </w:t>
-      </w:r>
-      <w:r>
-        <w:rPr>
-          <w:rFonts w:hint="eastAsia" w:ascii="Arial" w:hAnsi="Arial" w:eastAsia="宋体" w:cs="Arial"/>
-          <w:b w:val="0"/>
-          <w:bCs w:val="0"/>
           <w:color w:val="FF0000"/>
           <w:sz w:val="21"/>
           <w:szCs w:val="21"/>
           <w:shd w:val="clear" w:fill="auto"/>
           <w:lang w:val="en-US" w:eastAsia="zh-CN"/>
         </w:rPr>
-        <w:t>NOTE:It is recommended to download the NIHAO CHINA App and register, as well as bind a bank card or credit card. Then, you can use the ride code within the app to take the subway and buses in China conveniently. However, it would be best to exchange some RMB upon entering the Chinese territory.</w:t>
-      </w:r>
-    </w:p>
-    <w:p>
-      <w:pPr>
-        <w:keepNext w:val="0"/>
-        <w:keepLines w:val="0"/>
-        <w:pageBreakBefore w:val="0"/>
-        <w:widowControl w:val="0"/>
-        <w:numPr>
-          <w:ilvl w:val="0"/>
-          <w:numId w:val="0"/>
-        </w:numPr>
-        <w:overflowPunct/>
-        <w:bidi w:val="0"/>
-        <w:snapToGrid/>
-        <w:spacing w:line="240" w:lineRule="auto"/>
-        <w:ind w:left="0" w:firstLine="0"/>
-        <w:jc w:val="both"/>
-        <w:textAlignment w:val="auto"/>
-        <w:rPr>
-          <w:rFonts w:ascii="Arial" w:hAnsi="Arial" w:eastAsia="宋体" w:cs="Arial"/>
-          <w:b w:val="0"/>
-          <w:bCs w:val="0"/>
-          <w:color w:val="000000"/>
-          <w:sz w:val="21"/>
-          <w:szCs w:val="21"/>
-          <w:highlight w:val="none"/>
-          <w:shd w:val="clear" w:fill="auto"/>
-          <w:lang w:val="en-US" w:eastAsia="zh-CN"/>
-        </w:rPr>
-      </w:pPr>
+        <w:br w:type="page"/>
+      </w:r>
     </w:p>
     <w:p>
       <w:pPr>
@@ -4485,7 +4615,7 @@
       </w:pPr>
       <w:r>
         <w:rPr>
-          <w:rStyle w:val="9"/>
+          <w:rStyle w:val="10"/>
           <w:rFonts w:ascii="Arial" w:hAnsi="Arial" w:eastAsia="宋体" w:cs="Arial"/>
           <w:color w:val="000000"/>
           <w:sz w:val="21"/>
@@ -4497,7 +4627,7 @@
       </w:r>
       <w:r>
         <w:rPr>
-          <w:rStyle w:val="9"/>
+          <w:rStyle w:val="10"/>
           <w:rFonts w:ascii="Arial" w:hAnsi="Arial" w:eastAsia="宋体" w:cs="Arial"/>
           <w:color w:val="000000"/>
           <w:sz w:val="21"/>
@@ -4510,7 +4640,7 @@
       </w:r>
       <w:r>
         <w:rPr>
-          <w:rStyle w:val="9"/>
+          <w:rStyle w:val="10"/>
           <w:rFonts w:ascii="Arial" w:hAnsi="Arial" w:cs="Arial"/>
           <w:b w:val="0"/>
           <w:bCs w:val="0"/>
@@ -4692,7 +4822,10 @@
         <w:spacing w:line="360" w:lineRule="auto"/>
         <w:jc w:val="center"/>
         <w:rPr>
-          <w:color w:val="000000"/>
+          <w:rFonts w:ascii="Arial" w:hAnsi="Arial" w:cs="Arial"/>
+          <w:color w:val="000000"/>
+          <w:sz w:val="21"/>
+          <w:szCs w:val="21"/>
         </w:rPr>
       </w:pPr>
       <w:r>
@@ -4784,6 +4917,1499 @@
         </w:rPr>
         <w:t>《道藏》</w:t>
       </w:r>
+    </w:p>
+    <w:p>
+      <w:pPr>
+        <w:rPr>
+          <w:rFonts w:ascii="Arial" w:hAnsi="Arial" w:cs="Arial"/>
+          <w:color w:val="000000"/>
+          <w:sz w:val="21"/>
+          <w:szCs w:val="21"/>
+        </w:rPr>
+      </w:pPr>
+      <w:r>
+        <w:rPr>
+          <w:rFonts w:ascii="Arial" w:hAnsi="Arial" w:cs="Arial"/>
+          <w:color w:val="000000"/>
+          <w:sz w:val="21"/>
+          <w:szCs w:val="21"/>
+        </w:rPr>
+        <w:br w:type="page"/>
+      </w:r>
+    </w:p>
+    <w:p>
+      <w:pPr>
+        <w:spacing w:after="40" w:line="264" w:lineRule="auto"/>
+        <w:ind w:firstLine="0"/>
+        <w:jc w:val="center"/>
+        <w:rPr>
+          <w:color w:val="FF0000"/>
+          <w:sz w:val="28"/>
+          <w:szCs w:val="28"/>
+        </w:rPr>
+      </w:pPr>
+      <w:r>
+        <w:rPr>
+          <w:rFonts w:hint="default" w:ascii="Times New Roman" w:hAnsi="Times New Roman" w:eastAsia="Times New Roman" w:cs="Times New Roman"/>
+          <w:b/>
+          <w:color w:val="FF0000"/>
+          <w:sz w:val="32"/>
+          <w:szCs w:val="32"/>
+        </w:rPr>
+        <w:t>19th International Conference on Daoist Studies</w:t>
+      </w:r>
+      <w:r>
+        <w:rPr>
+          <w:rFonts w:hint="default" w:ascii="Times New Roman" w:hAnsi="Times New Roman" w:cs="Times New Roman"/>
+          <w:color w:val="FF0000"/>
+          <w:sz w:val="32"/>
+          <w:szCs w:val="32"/>
+        </w:rPr>
+        <w:br w:type="textWrapping"/>
+      </w:r>
+      <w:r>
+        <w:rPr>
+          <w:rFonts w:ascii="Times New Roman" w:hAnsi="Times New Roman" w:eastAsia="Times New Roman"/>
+          <w:b/>
+          <w:color w:val="FF0000"/>
+          <w:sz w:val="28"/>
+          <w:szCs w:val="28"/>
+        </w:rPr>
+        <w:t>第19届国际道学研讨会</w:t>
+      </w:r>
+    </w:p>
+    <w:p>
+      <w:pPr>
+        <w:spacing w:after="160" w:line="264" w:lineRule="auto"/>
+        <w:ind w:firstLine="0"/>
+        <w:jc w:val="center"/>
+        <w:rPr>
+          <w:b/>
+          <w:bCs w:val="0"/>
+          <w:color w:val="FF0000"/>
+          <w:sz w:val="28"/>
+          <w:szCs w:val="28"/>
+        </w:rPr>
+      </w:pPr>
+      <w:r>
+        <w:rPr>
+          <w:rFonts w:ascii="Times New Roman" w:hAnsi="Times New Roman" w:eastAsia="Times New Roman"/>
+          <w:b/>
+          <w:bCs w:val="0"/>
+          <w:color w:val="FF0000"/>
+          <w:sz w:val="28"/>
+          <w:szCs w:val="28"/>
+        </w:rPr>
+        <w:t>Registration Form (</w:t>
+      </w:r>
+      <w:r>
+        <w:rPr>
+          <w:rFonts w:hint="eastAsia" w:ascii="Times New Roman" w:hAnsi="Times New Roman" w:eastAsia="宋体"/>
+          <w:b/>
+          <w:bCs w:val="0"/>
+          <w:color w:val="FF0000"/>
+          <w:sz w:val="28"/>
+          <w:szCs w:val="28"/>
+          <w:lang w:val="en-US" w:eastAsia="zh-CN"/>
+        </w:rPr>
+        <w:t>报名表</w:t>
+      </w:r>
+      <w:r>
+        <w:rPr>
+          <w:rFonts w:ascii="Times New Roman" w:hAnsi="Times New Roman" w:eastAsia="Times New Roman"/>
+          <w:b/>
+          <w:bCs w:val="0"/>
+          <w:color w:val="FF0000"/>
+          <w:sz w:val="28"/>
+          <w:szCs w:val="28"/>
+        </w:rPr>
+        <w:t>)</w:t>
+      </w:r>
+    </w:p>
+    <w:tbl>
+      <w:tblPr>
+        <w:tblStyle w:val="7"/>
+        <w:tblW w:w="9012" w:type="dxa"/>
+        <w:jc w:val="center"/>
+        <w:tblBorders>
+          <w:top w:val="single" w:color="000000" w:sz="4" w:space="0"/>
+          <w:left w:val="single" w:color="000000" w:sz="4" w:space="0"/>
+          <w:bottom w:val="single" w:color="000000" w:sz="4" w:space="0"/>
+          <w:right w:val="single" w:color="000000" w:sz="4" w:space="0"/>
+          <w:insideH w:val="single" w:color="000000" w:sz="4" w:space="0"/>
+          <w:insideV w:val="single" w:color="000000" w:sz="4" w:space="0"/>
+        </w:tblBorders>
+        <w:tblLayout w:type="fixed"/>
+        <w:tblCellMar>
+          <w:top w:w="0" w:type="dxa"/>
+          <w:left w:w="108" w:type="dxa"/>
+          <w:bottom w:w="0" w:type="dxa"/>
+          <w:right w:w="108" w:type="dxa"/>
+        </w:tblCellMar>
+      </w:tblPr>
+      <w:tblGrid>
+        <w:gridCol w:w="981"/>
+        <w:gridCol w:w="1680"/>
+        <w:gridCol w:w="1880"/>
+        <w:gridCol w:w="1340"/>
+        <w:gridCol w:w="1780"/>
+        <w:gridCol w:w="1351"/>
+      </w:tblGrid>
+      <w:tr>
+        <w:trPr>
+          <w:cantSplit/>
+          <w:jc w:val="center"/>
+        </w:trPr>
+        <w:tc>
+          <w:tcPr>
+            <w:tcW w:w="981" w:type="dxa"/>
+            <w:shd w:val="clear" w:color="auto" w:fill="F2F2F2"/>
+            <w:vAlign w:val="center"/>
+          </w:tcPr>
+          <w:p>
+            <w:pPr>
+              <w:spacing w:before="0" w:after="0" w:line="276" w:lineRule="auto"/>
+              <w:ind w:firstLine="0"/>
+              <w:jc w:val="center"/>
+              <w:rPr>
+                <w:rFonts w:ascii="Times New Roman" w:hAnsi="Times New Roman" w:eastAsia="宋体"/>
+                <w:b/>
+                <w:bCs/>
+                <w:color w:val="FF0000"/>
+                <w:sz w:val="19"/>
+                <w:szCs w:val="19"/>
+              </w:rPr>
+            </w:pPr>
+            <w:r>
+              <w:rPr>
+                <w:rFonts w:ascii="Times New Roman" w:hAnsi="Times New Roman" w:eastAsia="宋体"/>
+                <w:b/>
+                <w:bCs/>
+                <w:color w:val="FF0000"/>
+                <w:sz w:val="19"/>
+                <w:szCs w:val="19"/>
+              </w:rPr>
+              <w:t xml:space="preserve">Name </w:t>
+            </w:r>
+          </w:p>
+          <w:p>
+            <w:pPr>
+              <w:spacing w:before="0" w:after="0" w:line="276" w:lineRule="auto"/>
+              <w:ind w:firstLine="0"/>
+              <w:jc w:val="center"/>
+              <w:rPr>
+                <w:b/>
+                <w:bCs/>
+                <w:color w:val="FF0000"/>
+              </w:rPr>
+            </w:pPr>
+            <w:r>
+              <w:rPr>
+                <w:rFonts w:ascii="Times New Roman" w:hAnsi="Times New Roman" w:eastAsia="宋体"/>
+                <w:b/>
+                <w:bCs/>
+                <w:color w:val="FF0000"/>
+                <w:sz w:val="19"/>
+                <w:szCs w:val="19"/>
+              </w:rPr>
+              <w:t>(姓名)</w:t>
+            </w:r>
+          </w:p>
+        </w:tc>
+        <w:tc>
+          <w:tcPr>
+            <w:tcW w:w="1680" w:type="dxa"/>
+            <w:vAlign w:val="center"/>
+          </w:tcPr>
+          <w:p>
+            <w:pPr>
+              <w:spacing w:before="0" w:after="0" w:line="276" w:lineRule="auto"/>
+              <w:ind w:firstLine="0"/>
+              <w:jc w:val="left"/>
+              <w:rPr>
+                <w:b/>
+                <w:bCs/>
+                <w:color w:val="FF0000"/>
+              </w:rPr>
+            </w:pPr>
+          </w:p>
+        </w:tc>
+        <w:tc>
+          <w:tcPr>
+            <w:tcW w:w="1880" w:type="dxa"/>
+            <w:shd w:val="clear" w:color="auto" w:fill="F2F2F2"/>
+            <w:vAlign w:val="center"/>
+          </w:tcPr>
+          <w:p>
+            <w:pPr>
+              <w:spacing w:before="0" w:after="0" w:line="276" w:lineRule="auto"/>
+              <w:ind w:firstLine="0"/>
+              <w:jc w:val="center"/>
+              <w:rPr>
+                <w:rFonts w:ascii="Times New Roman" w:hAnsi="Times New Roman" w:eastAsia="宋体"/>
+                <w:b/>
+                <w:bCs/>
+                <w:color w:val="FF0000"/>
+                <w:sz w:val="19"/>
+                <w:szCs w:val="19"/>
+              </w:rPr>
+            </w:pPr>
+            <w:r>
+              <w:rPr>
+                <w:rFonts w:ascii="Times New Roman" w:hAnsi="Times New Roman" w:eastAsia="宋体"/>
+                <w:b/>
+                <w:bCs/>
+                <w:color w:val="FF0000"/>
+                <w:sz w:val="19"/>
+                <w:szCs w:val="19"/>
+              </w:rPr>
+              <w:t xml:space="preserve">Nationality </w:t>
+            </w:r>
+          </w:p>
+          <w:p>
+            <w:pPr>
+              <w:spacing w:before="0" w:after="0" w:line="276" w:lineRule="auto"/>
+              <w:ind w:firstLine="0"/>
+              <w:jc w:val="center"/>
+              <w:rPr>
+                <w:b/>
+                <w:bCs/>
+                <w:color w:val="FF0000"/>
+              </w:rPr>
+            </w:pPr>
+            <w:r>
+              <w:rPr>
+                <w:rFonts w:ascii="Times New Roman" w:hAnsi="Times New Roman" w:eastAsia="宋体"/>
+                <w:b/>
+                <w:bCs/>
+                <w:color w:val="FF0000"/>
+                <w:sz w:val="19"/>
+                <w:szCs w:val="19"/>
+              </w:rPr>
+              <w:t>(国籍)</w:t>
+            </w:r>
+          </w:p>
+        </w:tc>
+        <w:tc>
+          <w:tcPr>
+            <w:tcW w:w="1340" w:type="dxa"/>
+            <w:vAlign w:val="center"/>
+          </w:tcPr>
+          <w:p>
+            <w:pPr>
+              <w:spacing w:before="0" w:after="0" w:line="276" w:lineRule="auto"/>
+              <w:ind w:firstLine="0"/>
+              <w:jc w:val="left"/>
+              <w:rPr>
+                <w:b/>
+                <w:bCs/>
+                <w:color w:val="FF0000"/>
+              </w:rPr>
+            </w:pPr>
+          </w:p>
+        </w:tc>
+        <w:tc>
+          <w:tcPr>
+            <w:tcW w:w="1780" w:type="dxa"/>
+            <w:shd w:val="clear" w:color="auto" w:fill="F2F2F2"/>
+            <w:vAlign w:val="center"/>
+          </w:tcPr>
+          <w:p>
+            <w:pPr>
+              <w:spacing w:before="0" w:after="0" w:line="276" w:lineRule="auto"/>
+              <w:ind w:firstLine="0"/>
+              <w:jc w:val="center"/>
+              <w:rPr>
+                <w:rFonts w:hint="eastAsia" w:ascii="Times New Roman" w:hAnsi="Times New Roman" w:eastAsia="宋体"/>
+                <w:b/>
+                <w:bCs/>
+                <w:color w:val="FF0000"/>
+                <w:sz w:val="19"/>
+                <w:szCs w:val="19"/>
+                <w:lang w:val="en-US" w:eastAsia="zh-CN"/>
+              </w:rPr>
+            </w:pPr>
+            <w:r>
+              <w:rPr>
+                <w:rFonts w:ascii="Times New Roman" w:hAnsi="Times New Roman" w:eastAsia="宋体"/>
+                <w:b/>
+                <w:bCs/>
+                <w:color w:val="FF0000"/>
+                <w:sz w:val="19"/>
+                <w:szCs w:val="19"/>
+              </w:rPr>
+              <w:t xml:space="preserve">Passport / ID </w:t>
+            </w:r>
+            <w:r>
+              <w:rPr>
+                <w:rFonts w:hint="eastAsia" w:ascii="Times New Roman" w:hAnsi="Times New Roman" w:eastAsia="宋体"/>
+                <w:b/>
+                <w:bCs/>
+                <w:color w:val="FF0000"/>
+                <w:sz w:val="19"/>
+                <w:szCs w:val="19"/>
+                <w:lang w:val="en-US" w:eastAsia="zh-CN"/>
+              </w:rPr>
+              <w:t>No.</w:t>
+            </w:r>
+          </w:p>
+          <w:p>
+            <w:pPr>
+              <w:spacing w:before="0" w:after="0" w:line="276" w:lineRule="auto"/>
+              <w:ind w:firstLine="0"/>
+              <w:jc w:val="center"/>
+              <w:rPr>
+                <w:b/>
+                <w:bCs/>
+                <w:color w:val="FF0000"/>
+              </w:rPr>
+            </w:pPr>
+            <w:r>
+              <w:rPr>
+                <w:rFonts w:ascii="Times New Roman" w:hAnsi="Times New Roman" w:eastAsia="宋体"/>
+                <w:b/>
+                <w:bCs/>
+                <w:color w:val="FF0000"/>
+                <w:sz w:val="19"/>
+                <w:szCs w:val="19"/>
+              </w:rPr>
+              <w:t>(护照/</w:t>
+            </w:r>
+            <w:r>
+              <w:rPr>
+                <w:rFonts w:hint="eastAsia" w:ascii="Times New Roman" w:hAnsi="Times New Roman" w:eastAsia="宋体"/>
+                <w:b/>
+                <w:bCs/>
+                <w:color w:val="FF0000"/>
+                <w:sz w:val="19"/>
+                <w:szCs w:val="19"/>
+                <w:lang w:val="en-US" w:eastAsia="zh-CN"/>
+              </w:rPr>
+              <w:t>身份证号码</w:t>
+            </w:r>
+            <w:r>
+              <w:rPr>
+                <w:rFonts w:ascii="Times New Roman" w:hAnsi="Times New Roman" w:eastAsia="宋体"/>
+                <w:b/>
+                <w:bCs/>
+                <w:color w:val="FF0000"/>
+                <w:sz w:val="19"/>
+                <w:szCs w:val="19"/>
+              </w:rPr>
+              <w:t>)</w:t>
+            </w:r>
+          </w:p>
+        </w:tc>
+        <w:tc>
+          <w:tcPr>
+            <w:tcW w:w="1351" w:type="dxa"/>
+            <w:vAlign w:val="center"/>
+          </w:tcPr>
+          <w:p>
+            <w:pPr>
+              <w:spacing w:before="0" w:after="0" w:line="276" w:lineRule="auto"/>
+              <w:ind w:firstLine="0"/>
+              <w:jc w:val="left"/>
+              <w:rPr>
+                <w:b/>
+                <w:bCs/>
+                <w:color w:val="FF0000"/>
+              </w:rPr>
+            </w:pPr>
+          </w:p>
+        </w:tc>
+      </w:tr>
+      <w:tr>
+        <w:trPr>
+          <w:cantSplit/>
+          <w:jc w:val="center"/>
+        </w:trPr>
+        <w:tc>
+          <w:tcPr>
+            <w:tcW w:w="2661" w:type="dxa"/>
+            <w:gridSpan w:val="2"/>
+            <w:shd w:val="clear" w:color="auto" w:fill="F2F2F2"/>
+            <w:vAlign w:val="center"/>
+          </w:tcPr>
+          <w:p>
+            <w:pPr>
+              <w:spacing w:before="0" w:after="0" w:line="276" w:lineRule="auto"/>
+              <w:ind w:firstLine="0"/>
+              <w:jc w:val="center"/>
+              <w:rPr>
+                <w:b/>
+                <w:bCs/>
+                <w:color w:val="FF0000"/>
+              </w:rPr>
+            </w:pPr>
+            <w:r>
+              <w:rPr>
+                <w:rFonts w:ascii="Times New Roman" w:hAnsi="Times New Roman" w:eastAsia="宋体"/>
+                <w:b/>
+                <w:bCs/>
+                <w:color w:val="FF0000"/>
+                <w:sz w:val="19"/>
+                <w:szCs w:val="19"/>
+              </w:rPr>
+              <w:t>Institution (工作单位)</w:t>
+            </w:r>
+          </w:p>
+        </w:tc>
+        <w:tc>
+          <w:tcPr>
+            <w:tcW w:w="6351" w:type="dxa"/>
+            <w:gridSpan w:val="4"/>
+            <w:vAlign w:val="center"/>
+          </w:tcPr>
+          <w:p>
+            <w:pPr>
+              <w:spacing w:before="0" w:after="0" w:line="276" w:lineRule="auto"/>
+              <w:ind w:firstLine="0"/>
+              <w:jc w:val="left"/>
+              <w:rPr>
+                <w:b/>
+                <w:bCs/>
+                <w:color w:val="FF0000"/>
+              </w:rPr>
+            </w:pPr>
+          </w:p>
+          <w:p>
+            <w:pPr>
+              <w:spacing w:before="0" w:after="0" w:line="276" w:lineRule="auto"/>
+              <w:ind w:firstLine="0"/>
+              <w:rPr>
+                <w:b/>
+                <w:bCs/>
+                <w:color w:val="FF0000"/>
+              </w:rPr>
+            </w:pPr>
+          </w:p>
+        </w:tc>
+      </w:tr>
+      <w:tr>
+        <w:trPr>
+          <w:cantSplit/>
+          <w:jc w:val="center"/>
+        </w:trPr>
+        <w:tc>
+          <w:tcPr>
+            <w:tcW w:w="2661" w:type="dxa"/>
+            <w:gridSpan w:val="2"/>
+            <w:shd w:val="clear" w:color="auto" w:fill="F2F2F2"/>
+            <w:vAlign w:val="center"/>
+          </w:tcPr>
+          <w:p>
+            <w:pPr>
+              <w:spacing w:before="0" w:after="0" w:line="276" w:lineRule="auto"/>
+              <w:ind w:firstLine="0"/>
+              <w:jc w:val="center"/>
+              <w:rPr>
+                <w:b/>
+                <w:bCs/>
+                <w:color w:val="FF0000"/>
+              </w:rPr>
+            </w:pPr>
+            <w:r>
+              <w:rPr>
+                <w:rFonts w:hint="eastAsia" w:ascii="Times New Roman" w:hAnsi="Times New Roman" w:eastAsia="宋体"/>
+                <w:b/>
+                <w:bCs/>
+                <w:color w:val="FF0000"/>
+                <w:sz w:val="19"/>
+                <w:szCs w:val="19"/>
+              </w:rPr>
+              <w:t>Mobile number</w:t>
+            </w:r>
+            <w:r>
+              <w:rPr>
+                <w:rFonts w:ascii="Times New Roman" w:hAnsi="Times New Roman" w:eastAsia="宋体"/>
+                <w:b/>
+                <w:bCs/>
+                <w:color w:val="FF0000"/>
+                <w:sz w:val="19"/>
+                <w:szCs w:val="19"/>
+              </w:rPr>
+              <w:t xml:space="preserve"> (</w:t>
+            </w:r>
+            <w:r>
+              <w:rPr>
+                <w:rFonts w:hint="eastAsia" w:ascii="Times New Roman" w:hAnsi="Times New Roman" w:eastAsia="宋体"/>
+                <w:b/>
+                <w:bCs/>
+                <w:color w:val="FF0000"/>
+                <w:sz w:val="19"/>
+                <w:szCs w:val="19"/>
+                <w:lang w:val="en-US" w:eastAsia="zh-CN"/>
+              </w:rPr>
+              <w:t>手机号码</w:t>
+            </w:r>
+            <w:r>
+              <w:rPr>
+                <w:rFonts w:ascii="Times New Roman" w:hAnsi="Times New Roman" w:eastAsia="宋体"/>
+                <w:b/>
+                <w:bCs/>
+                <w:color w:val="FF0000"/>
+                <w:sz w:val="19"/>
+                <w:szCs w:val="19"/>
+              </w:rPr>
+              <w:t>)</w:t>
+            </w:r>
+          </w:p>
+        </w:tc>
+        <w:tc>
+          <w:tcPr>
+            <w:tcW w:w="1880" w:type="dxa"/>
+            <w:vAlign w:val="center"/>
+          </w:tcPr>
+          <w:p>
+            <w:pPr>
+              <w:spacing w:before="0" w:after="0" w:line="276" w:lineRule="auto"/>
+              <w:ind w:firstLine="0"/>
+              <w:jc w:val="left"/>
+              <w:rPr>
+                <w:b/>
+                <w:bCs/>
+                <w:color w:val="FF0000"/>
+              </w:rPr>
+            </w:pPr>
+          </w:p>
+          <w:p>
+            <w:pPr>
+              <w:spacing w:before="0" w:after="0" w:line="276" w:lineRule="auto"/>
+              <w:ind w:firstLine="0"/>
+              <w:rPr>
+                <w:b/>
+                <w:bCs/>
+                <w:color w:val="FF0000"/>
+              </w:rPr>
+            </w:pPr>
+          </w:p>
+        </w:tc>
+        <w:tc>
+          <w:tcPr>
+            <w:tcW w:w="1340" w:type="dxa"/>
+            <w:shd w:val="clear" w:color="auto" w:fill="F2F2F2"/>
+            <w:vAlign w:val="center"/>
+          </w:tcPr>
+          <w:p>
+            <w:pPr>
+              <w:spacing w:before="0" w:after="0" w:line="276" w:lineRule="auto"/>
+              <w:ind w:firstLine="0"/>
+              <w:jc w:val="center"/>
+              <w:rPr>
+                <w:b/>
+                <w:bCs/>
+                <w:color w:val="FF0000"/>
+              </w:rPr>
+            </w:pPr>
+            <w:r>
+              <w:rPr>
+                <w:rFonts w:ascii="Times New Roman" w:hAnsi="Times New Roman" w:eastAsia="宋体"/>
+                <w:b/>
+                <w:bCs/>
+                <w:color w:val="FF0000"/>
+                <w:sz w:val="19"/>
+                <w:szCs w:val="19"/>
+              </w:rPr>
+              <w:t>E-mail (邮箱)</w:t>
+            </w:r>
+          </w:p>
+        </w:tc>
+        <w:tc>
+          <w:tcPr>
+            <w:tcW w:w="3131" w:type="dxa"/>
+            <w:gridSpan w:val="2"/>
+            <w:vAlign w:val="center"/>
+          </w:tcPr>
+          <w:p>
+            <w:pPr>
+              <w:spacing w:before="0" w:after="0" w:line="276" w:lineRule="auto"/>
+              <w:ind w:firstLine="0"/>
+              <w:jc w:val="left"/>
+              <w:rPr>
+                <w:b/>
+                <w:bCs/>
+                <w:color w:val="FF0000"/>
+              </w:rPr>
+            </w:pPr>
+          </w:p>
+          <w:p>
+            <w:pPr>
+              <w:spacing w:before="0" w:after="0" w:line="276" w:lineRule="auto"/>
+              <w:ind w:firstLine="0"/>
+              <w:rPr>
+                <w:b/>
+                <w:bCs/>
+                <w:color w:val="FF0000"/>
+              </w:rPr>
+            </w:pPr>
+          </w:p>
+        </w:tc>
+      </w:tr>
+      <w:tr>
+        <w:trPr>
+          <w:cantSplit/>
+          <w:jc w:val="center"/>
+        </w:trPr>
+        <w:tc>
+          <w:tcPr>
+            <w:tcW w:w="2661" w:type="dxa"/>
+            <w:gridSpan w:val="2"/>
+            <w:shd w:val="clear" w:color="auto" w:fill="F2F2F2"/>
+            <w:vAlign w:val="center"/>
+          </w:tcPr>
+          <w:p>
+            <w:pPr>
+              <w:spacing w:before="0" w:after="0" w:line="276" w:lineRule="auto"/>
+              <w:ind w:firstLine="0"/>
+              <w:jc w:val="center"/>
+              <w:rPr>
+                <w:b/>
+                <w:bCs/>
+                <w:color w:val="FF0000"/>
+              </w:rPr>
+            </w:pPr>
+            <w:r>
+              <w:rPr>
+                <w:rFonts w:ascii="Times New Roman" w:hAnsi="Times New Roman" w:eastAsia="宋体"/>
+                <w:b/>
+                <w:bCs/>
+                <w:color w:val="FF0000"/>
+                <w:sz w:val="19"/>
+                <w:szCs w:val="19"/>
+              </w:rPr>
+              <w:t>Paper Title (论文题目)</w:t>
+            </w:r>
+          </w:p>
+        </w:tc>
+        <w:tc>
+          <w:tcPr>
+            <w:tcW w:w="6351" w:type="dxa"/>
+            <w:gridSpan w:val="4"/>
+            <w:vAlign w:val="center"/>
+          </w:tcPr>
+          <w:p>
+            <w:pPr>
+              <w:spacing w:before="0" w:after="0" w:line="276" w:lineRule="auto"/>
+              <w:ind w:firstLine="0"/>
+              <w:jc w:val="left"/>
+              <w:rPr>
+                <w:b/>
+                <w:bCs/>
+                <w:color w:val="FF0000"/>
+              </w:rPr>
+            </w:pPr>
+          </w:p>
+          <w:p>
+            <w:pPr>
+              <w:spacing w:before="0" w:after="0" w:line="276" w:lineRule="auto"/>
+              <w:ind w:firstLine="0"/>
+              <w:rPr>
+                <w:b/>
+                <w:bCs/>
+                <w:color w:val="FF0000"/>
+              </w:rPr>
+            </w:pPr>
+          </w:p>
+        </w:tc>
+      </w:tr>
+      <w:tr>
+        <w:trPr>
+          <w:cantSplit/>
+          <w:trHeight w:val="2976" w:hRule="atLeast"/>
+          <w:jc w:val="center"/>
+        </w:trPr>
+        <w:tc>
+          <w:tcPr>
+            <w:tcW w:w="2661" w:type="dxa"/>
+            <w:gridSpan w:val="2"/>
+            <w:shd w:val="clear" w:color="auto" w:fill="F2F2F2"/>
+            <w:vAlign w:val="center"/>
+          </w:tcPr>
+          <w:p>
+            <w:pPr>
+              <w:spacing w:before="0" w:after="0" w:line="276" w:lineRule="auto"/>
+              <w:ind w:firstLine="0"/>
+              <w:jc w:val="center"/>
+              <w:rPr>
+                <w:b/>
+                <w:bCs/>
+                <w:color w:val="FF0000"/>
+              </w:rPr>
+            </w:pPr>
+            <w:r>
+              <w:rPr>
+                <w:rFonts w:ascii="Times New Roman" w:hAnsi="Times New Roman" w:eastAsia="宋体"/>
+                <w:b/>
+                <w:bCs/>
+                <w:color w:val="FF0000"/>
+                <w:sz w:val="19"/>
+                <w:szCs w:val="19"/>
+              </w:rPr>
+              <w:t>Abstract (内容摘要)</w:t>
+            </w:r>
+          </w:p>
+        </w:tc>
+        <w:tc>
+          <w:tcPr>
+            <w:tcW w:w="6351" w:type="dxa"/>
+            <w:gridSpan w:val="4"/>
+            <w:vAlign w:val="top"/>
+          </w:tcPr>
+          <w:p>
+            <w:pPr>
+              <w:spacing w:before="0" w:after="0" w:line="276" w:lineRule="auto"/>
+              <w:ind w:firstLine="0"/>
+              <w:jc w:val="left"/>
+              <w:rPr>
+                <w:b/>
+                <w:bCs/>
+                <w:color w:val="FF0000"/>
+              </w:rPr>
+            </w:pPr>
+          </w:p>
+          <w:p>
+            <w:pPr>
+              <w:spacing w:before="0" w:after="0" w:line="276" w:lineRule="auto"/>
+              <w:ind w:firstLine="0"/>
+              <w:rPr>
+                <w:b/>
+                <w:bCs/>
+                <w:color w:val="FF0000"/>
+              </w:rPr>
+            </w:pPr>
+          </w:p>
+          <w:p>
+            <w:pPr>
+              <w:spacing w:before="0" w:after="0" w:line="276" w:lineRule="auto"/>
+              <w:ind w:firstLine="0"/>
+              <w:rPr>
+                <w:b/>
+                <w:bCs/>
+                <w:color w:val="FF0000"/>
+              </w:rPr>
+            </w:pPr>
+          </w:p>
+          <w:p>
+            <w:pPr>
+              <w:spacing w:before="0" w:after="0" w:line="276" w:lineRule="auto"/>
+              <w:ind w:firstLine="0"/>
+              <w:rPr>
+                <w:b/>
+                <w:bCs/>
+                <w:color w:val="FF0000"/>
+              </w:rPr>
+            </w:pPr>
+          </w:p>
+          <w:p>
+            <w:pPr>
+              <w:spacing w:before="0" w:after="0" w:line="276" w:lineRule="auto"/>
+              <w:ind w:firstLine="0"/>
+              <w:rPr>
+                <w:b/>
+                <w:bCs/>
+                <w:color w:val="FF0000"/>
+              </w:rPr>
+            </w:pPr>
+          </w:p>
+          <w:p>
+            <w:pPr>
+              <w:spacing w:before="0" w:after="0" w:line="276" w:lineRule="auto"/>
+              <w:ind w:firstLine="0"/>
+              <w:rPr>
+                <w:b/>
+                <w:bCs/>
+                <w:color w:val="FF0000"/>
+              </w:rPr>
+            </w:pPr>
+          </w:p>
+          <w:p>
+            <w:pPr>
+              <w:spacing w:before="0" w:after="0" w:line="276" w:lineRule="auto"/>
+              <w:ind w:firstLine="0"/>
+              <w:rPr>
+                <w:b/>
+                <w:bCs/>
+                <w:color w:val="FF0000"/>
+              </w:rPr>
+            </w:pPr>
+          </w:p>
+        </w:tc>
+      </w:tr>
+      <w:tr>
+        <w:trPr>
+          <w:cantSplit/>
+          <w:jc w:val="center"/>
+        </w:trPr>
+        <w:tc>
+          <w:tcPr>
+            <w:tcW w:w="4541" w:type="dxa"/>
+            <w:gridSpan w:val="3"/>
+            <w:shd w:val="clear" w:color="auto" w:fill="F2F2F2"/>
+            <w:vAlign w:val="center"/>
+          </w:tcPr>
+          <w:p>
+            <w:pPr>
+              <w:spacing w:before="0" w:after="0" w:line="276" w:lineRule="auto"/>
+              <w:ind w:firstLine="0"/>
+              <w:jc w:val="center"/>
+              <w:rPr>
+                <w:b/>
+                <w:bCs/>
+                <w:color w:val="FF0000"/>
+              </w:rPr>
+            </w:pPr>
+            <w:r>
+              <w:rPr>
+                <w:rFonts w:ascii="Times New Roman" w:hAnsi="Times New Roman" w:eastAsia="宋体"/>
+                <w:b/>
+                <w:bCs/>
+                <w:color w:val="FF0000"/>
+                <w:sz w:val="19"/>
+                <w:szCs w:val="19"/>
+              </w:rPr>
+              <w:t xml:space="preserve">Book </w:t>
+            </w:r>
+            <w:r>
+              <w:rPr>
+                <w:rFonts w:hint="eastAsia" w:ascii="Times New Roman" w:hAnsi="Times New Roman" w:eastAsia="宋体"/>
+                <w:b/>
+                <w:bCs/>
+                <w:color w:val="FF0000"/>
+                <w:sz w:val="19"/>
+                <w:szCs w:val="19"/>
+                <w:lang w:val="en-US" w:eastAsia="zh-CN"/>
+              </w:rPr>
+              <w:t xml:space="preserve">the </w:t>
+            </w:r>
+            <w:r>
+              <w:rPr>
+                <w:rFonts w:ascii="Times New Roman" w:hAnsi="Times New Roman" w:eastAsia="宋体"/>
+                <w:b/>
+                <w:bCs/>
+                <w:color w:val="FF0000"/>
+                <w:sz w:val="19"/>
+                <w:szCs w:val="19"/>
+              </w:rPr>
+              <w:t>Hotel Wufeng</w:t>
+            </w:r>
+            <w:r>
+              <w:rPr>
+                <w:rFonts w:hint="eastAsia"/>
+                <w:b/>
+                <w:bCs/>
+                <w:color w:val="FF0000"/>
+                <w:sz w:val="19"/>
+                <w:szCs w:val="19"/>
+                <w:lang w:val="en-US" w:eastAsia="zh-CN"/>
+              </w:rPr>
+              <w:t>ge</w:t>
+            </w:r>
+            <w:r>
+              <w:rPr>
+                <w:rFonts w:ascii="Times New Roman" w:hAnsi="Times New Roman" w:eastAsia="宋体"/>
+                <w:b/>
+                <w:bCs/>
+                <w:color w:val="FF0000"/>
+                <w:sz w:val="19"/>
+                <w:szCs w:val="19"/>
+              </w:rPr>
+              <w:t xml:space="preserve"> for 3 nights?</w:t>
+            </w:r>
+            <w:r>
+              <w:rPr>
+                <w:b/>
+                <w:bCs/>
+                <w:color w:val="FF0000"/>
+              </w:rPr>
+              <w:br w:type="textWrapping"/>
+            </w:r>
+            <w:r>
+              <w:rPr>
+                <w:rFonts w:ascii="Times New Roman" w:hAnsi="Times New Roman" w:eastAsia="宋体"/>
+                <w:b/>
+                <w:bCs/>
+                <w:color w:val="FF0000"/>
+                <w:sz w:val="19"/>
+                <w:szCs w:val="19"/>
+              </w:rPr>
+              <w:t>(代订3晚五峰阁宾馆)    Yes □  No □</w:t>
+            </w:r>
+          </w:p>
+        </w:tc>
+        <w:tc>
+          <w:tcPr>
+            <w:tcW w:w="4471" w:type="dxa"/>
+            <w:gridSpan w:val="3"/>
+            <w:shd w:val="clear" w:color="auto" w:fill="F2F2F2"/>
+            <w:vAlign w:val="center"/>
+          </w:tcPr>
+          <w:p>
+            <w:pPr>
+              <w:spacing w:before="0" w:after="0" w:line="276" w:lineRule="auto"/>
+              <w:ind w:firstLine="0"/>
+              <w:jc w:val="center"/>
+              <w:rPr>
+                <w:b/>
+                <w:bCs/>
+                <w:color w:val="FF0000"/>
+              </w:rPr>
+            </w:pPr>
+            <w:r>
+              <w:rPr>
+                <w:rFonts w:ascii="Times New Roman" w:hAnsi="Times New Roman" w:eastAsia="宋体"/>
+                <w:b/>
+                <w:bCs/>
+                <w:color w:val="FF0000"/>
+                <w:sz w:val="19"/>
+                <w:szCs w:val="19"/>
+              </w:rPr>
+              <w:t>Book a hotel near Qingdao Airport for May 29?</w:t>
+            </w:r>
+            <w:r>
+              <w:rPr>
+                <w:b/>
+                <w:bCs/>
+                <w:color w:val="FF0000"/>
+              </w:rPr>
+              <w:br w:type="textWrapping"/>
+            </w:r>
+            <w:r>
+              <w:rPr>
+                <w:rFonts w:ascii="Times New Roman" w:hAnsi="Times New Roman" w:eastAsia="宋体"/>
+                <w:b/>
+                <w:bCs/>
+                <w:color w:val="FF0000"/>
+                <w:sz w:val="19"/>
+                <w:szCs w:val="19"/>
+              </w:rPr>
+              <w:t>(代订29日青岛机场附近酒店)    Yes □  No □</w:t>
+            </w:r>
+          </w:p>
+        </w:tc>
+      </w:tr>
+      <w:tr>
+        <w:trPr>
+          <w:cantSplit/>
+          <w:jc w:val="center"/>
+        </w:trPr>
+        <w:tc>
+          <w:tcPr>
+            <w:tcW w:w="5881" w:type="dxa"/>
+            <w:gridSpan w:val="4"/>
+            <w:shd w:val="clear" w:color="auto" w:fill="F2F2F2"/>
+            <w:vAlign w:val="center"/>
+          </w:tcPr>
+          <w:p>
+            <w:pPr>
+              <w:spacing w:before="0" w:after="0" w:line="276" w:lineRule="auto"/>
+              <w:ind w:firstLine="0"/>
+              <w:jc w:val="center"/>
+              <w:rPr>
+                <w:b/>
+                <w:bCs/>
+                <w:color w:val="FF0000"/>
+              </w:rPr>
+            </w:pPr>
+            <w:r>
+              <w:rPr>
+                <w:rFonts w:ascii="Times New Roman" w:hAnsi="Times New Roman" w:eastAsia="宋体"/>
+                <w:b/>
+                <w:bCs/>
+                <w:color w:val="FF0000"/>
+                <w:sz w:val="19"/>
+                <w:szCs w:val="19"/>
+              </w:rPr>
+              <w:t xml:space="preserve">Join the </w:t>
+            </w:r>
+            <w:r>
+              <w:rPr>
+                <w:rFonts w:hint="eastAsia" w:ascii="Times New Roman" w:hAnsi="Times New Roman" w:eastAsia="宋体"/>
+                <w:b/>
+                <w:bCs/>
+                <w:color w:val="FF0000"/>
+                <w:sz w:val="19"/>
+                <w:szCs w:val="19"/>
+              </w:rPr>
+              <w:t>excursion</w:t>
+            </w:r>
+            <w:r>
+              <w:rPr>
+                <w:rFonts w:hint="eastAsia" w:ascii="Times New Roman" w:hAnsi="Times New Roman" w:eastAsia="宋体"/>
+                <w:b/>
+                <w:bCs/>
+                <w:color w:val="FF0000"/>
+                <w:sz w:val="19"/>
+                <w:szCs w:val="19"/>
+                <w:lang w:val="en-US" w:eastAsia="zh-CN"/>
+              </w:rPr>
+              <w:t xml:space="preserve"> to </w:t>
+            </w:r>
+            <w:r>
+              <w:rPr>
+                <w:rFonts w:ascii="Times New Roman" w:hAnsi="Times New Roman" w:eastAsia="宋体"/>
+                <w:b/>
+                <w:bCs/>
+                <w:color w:val="FF0000"/>
+                <w:sz w:val="19"/>
+                <w:szCs w:val="19"/>
+              </w:rPr>
+              <w:t>Mount Tai &amp;Mount Lao from May 28 to 29?</w:t>
+            </w:r>
+            <w:r>
+              <w:rPr>
+                <w:b/>
+                <w:bCs/>
+                <w:color w:val="FF0000"/>
+              </w:rPr>
+              <w:br w:type="textWrapping"/>
+            </w:r>
+            <w:r>
+              <w:rPr>
+                <w:rFonts w:ascii="Times New Roman" w:hAnsi="Times New Roman" w:eastAsia="宋体"/>
+                <w:b/>
+                <w:bCs/>
+                <w:color w:val="FF0000"/>
+                <w:sz w:val="19"/>
+                <w:szCs w:val="19"/>
+              </w:rPr>
+              <w:t>(参加28</w:t>
+            </w:r>
+            <w:r>
+              <w:rPr>
+                <w:rFonts w:hint="eastAsia"/>
+                <w:b/>
+                <w:bCs/>
+                <w:color w:val="FF0000"/>
+                <w:sz w:val="19"/>
+                <w:szCs w:val="19"/>
+                <w:lang w:val="en-US" w:eastAsia="zh-CN"/>
+              </w:rPr>
+              <w:t>-</w:t>
+            </w:r>
+            <w:r>
+              <w:rPr>
+                <w:rFonts w:ascii="Times New Roman" w:hAnsi="Times New Roman" w:eastAsia="宋体"/>
+                <w:b/>
+                <w:bCs/>
+                <w:color w:val="FF0000"/>
+                <w:sz w:val="19"/>
+                <w:szCs w:val="19"/>
+              </w:rPr>
+              <w:t>29日泰山和崂山考察)</w:t>
+            </w:r>
+          </w:p>
+        </w:tc>
+        <w:tc>
+          <w:tcPr>
+            <w:tcW w:w="3131" w:type="dxa"/>
+            <w:gridSpan w:val="2"/>
+            <w:vAlign w:val="center"/>
+          </w:tcPr>
+          <w:p>
+            <w:pPr>
+              <w:spacing w:before="0" w:after="0" w:line="276" w:lineRule="auto"/>
+              <w:ind w:firstLine="0"/>
+              <w:jc w:val="center"/>
+              <w:rPr>
+                <w:b/>
+                <w:bCs/>
+                <w:color w:val="FF0000"/>
+              </w:rPr>
+            </w:pPr>
+            <w:r>
+              <w:rPr>
+                <w:rFonts w:ascii="Times New Roman" w:hAnsi="Times New Roman" w:eastAsia="宋体"/>
+                <w:b/>
+                <w:bCs/>
+                <w:color w:val="FF0000"/>
+                <w:sz w:val="19"/>
+                <w:szCs w:val="19"/>
+              </w:rPr>
+              <w:t>Yes □  No □</w:t>
+            </w:r>
+          </w:p>
+        </w:tc>
+      </w:tr>
+    </w:tbl>
+    <w:p>
+      <w:pPr>
+        <w:keepNext w:val="0"/>
+        <w:keepLines w:val="0"/>
+        <w:pageBreakBefore w:val="0"/>
+        <w:widowControl/>
+        <w:kinsoku/>
+        <w:wordWrap/>
+        <w:overflowPunct/>
+        <w:topLinePunct w:val="0"/>
+        <w:autoSpaceDE/>
+        <w:autoSpaceDN/>
+        <w:bidi w:val="0"/>
+        <w:adjustRightInd/>
+        <w:snapToGrid/>
+        <w:spacing w:before="0" w:line="240" w:lineRule="auto"/>
+        <w:ind w:firstLine="0"/>
+        <w:jc w:val="both"/>
+        <w:textAlignment w:val="auto"/>
+        <w:rPr>
+          <w:rFonts w:hint="default" w:ascii="Times New Roman" w:hAnsi="Times New Roman" w:eastAsia="宋体" w:cs="Times New Roman"/>
+          <w:b w:val="0"/>
+          <w:color w:val="FF0000"/>
+          <w:sz w:val="18"/>
+          <w:szCs w:val="18"/>
+          <w:lang w:val="en-US" w:eastAsia="zh-CN"/>
+        </w:rPr>
+      </w:pPr>
+      <w:r>
+        <w:rPr>
+          <w:rFonts w:hint="default" w:ascii="Times New Roman" w:hAnsi="Times New Roman" w:eastAsia="宋体" w:cs="Times New Roman"/>
+          <w:b/>
+          <w:bCs/>
+          <w:color w:val="FF0000"/>
+          <w:sz w:val="18"/>
+          <w:szCs w:val="18"/>
+        </w:rPr>
+        <w:t>NOTE ：</w:t>
+      </w:r>
+      <w:r>
+        <w:rPr>
+          <w:rFonts w:hint="default" w:ascii="Times New Roman" w:hAnsi="Times New Roman" w:eastAsia="宋体" w:cs="Times New Roman"/>
+          <w:b w:val="0"/>
+          <w:color w:val="FF0000"/>
+          <w:sz w:val="18"/>
+          <w:szCs w:val="18"/>
+        </w:rPr>
+        <w:t xml:space="preserve">Please fill in all items ；Tick “Yes □ / No □” ；Residents from Hong Kong, Macao and Taiwan, please fill in your </w:t>
+      </w:r>
+      <w:r>
+        <w:rPr>
+          <w:rFonts w:hint="default" w:ascii="Times New Roman" w:hAnsi="Times New Roman" w:eastAsia="宋体" w:cs="Times New Roman"/>
+          <w:b w:val="0"/>
+          <w:color w:val="FF0000"/>
+          <w:sz w:val="18"/>
+          <w:szCs w:val="18"/>
+          <w:lang w:val="en-US" w:eastAsia="zh-CN"/>
+        </w:rPr>
+        <w:t>p</w:t>
+      </w:r>
+      <w:r>
+        <w:rPr>
+          <w:rFonts w:hint="default" w:ascii="Times New Roman" w:hAnsi="Times New Roman" w:eastAsia="宋体" w:cs="Times New Roman"/>
+          <w:b w:val="0"/>
+          <w:color w:val="FF0000"/>
+          <w:sz w:val="18"/>
+          <w:szCs w:val="18"/>
+        </w:rPr>
+        <w:t>assport number for travel to the mainland.</w:t>
+      </w:r>
+      <w:r>
+        <w:rPr>
+          <w:rFonts w:hint="default" w:ascii="Times New Roman" w:hAnsi="Times New Roman" w:eastAsia="宋体" w:cs="Times New Roman"/>
+          <w:b w:val="0"/>
+          <w:color w:val="FF0000"/>
+          <w:sz w:val="18"/>
+          <w:szCs w:val="18"/>
+          <w:lang w:val="en-US" w:eastAsia="zh-CN"/>
+        </w:rPr>
+        <w:t xml:space="preserve"> </w:t>
+      </w:r>
+      <w:r>
+        <w:rPr>
+          <w:rFonts w:hint="default" w:ascii="Times New Roman" w:hAnsi="Times New Roman" w:eastAsia="宋体" w:cs="Times New Roman"/>
+          <w:b w:val="0"/>
+          <w:color w:val="FF0000"/>
+          <w:sz w:val="18"/>
+          <w:szCs w:val="18"/>
+        </w:rPr>
+        <w:t xml:space="preserve">If you have any questions, please contact the organizing committee </w:t>
+      </w:r>
+      <w:r>
+        <w:rPr>
+          <w:rFonts w:hint="default" w:ascii="Times New Roman" w:hAnsi="Times New Roman" w:cs="Times New Roman"/>
+          <w:b w:val="0"/>
+          <w:color w:val="FF0000"/>
+          <w:sz w:val="18"/>
+          <w:szCs w:val="18"/>
+          <w:lang w:val="en-US" w:eastAsia="zh-CN"/>
+        </w:rPr>
+        <w:t>via this mail-box:</w:t>
+      </w:r>
+      <w:r>
+        <w:rPr>
+          <w:rFonts w:hint="default" w:ascii="Times New Roman" w:hAnsi="Times New Roman" w:eastAsia="宋体" w:cs="Times New Roman"/>
+          <w:b w:val="0"/>
+          <w:color w:val="FF0000"/>
+          <w:sz w:val="18"/>
+          <w:szCs w:val="18"/>
+        </w:rPr>
+        <w:t xml:space="preserve"> </w:t>
+      </w:r>
+      <w:r>
+        <w:rPr>
+          <w:rFonts w:hint="default" w:ascii="Times New Roman" w:hAnsi="Times New Roman" w:eastAsia="宋体" w:cs="Times New Roman"/>
+          <w:b w:val="0"/>
+          <w:color w:val="FF0000"/>
+          <w:sz w:val="18"/>
+          <w:szCs w:val="18"/>
+          <w:lang w:val="en-US" w:eastAsia="zh-CN"/>
+        </w:rPr>
+        <w:t>sduforum</w:t>
+      </w:r>
+      <w:r>
+        <w:rPr>
+          <w:rFonts w:hint="default" w:ascii="Times New Roman" w:hAnsi="Times New Roman" w:eastAsia="宋体" w:cs="Times New Roman"/>
+          <w:b w:val="0"/>
+          <w:color w:val="FF0000"/>
+          <w:sz w:val="18"/>
+          <w:szCs w:val="18"/>
+        </w:rPr>
+        <w:t xml:space="preserve">@163.com </w:t>
+      </w:r>
+      <w:r>
+        <w:rPr>
+          <w:rFonts w:hint="default" w:ascii="Times New Roman" w:hAnsi="Times New Roman" w:cs="Times New Roman"/>
+          <w:b w:val="0"/>
+          <w:color w:val="FF0000"/>
+          <w:sz w:val="18"/>
+          <w:szCs w:val="18"/>
+          <w:lang w:val="en-US" w:eastAsia="zh-CN"/>
+        </w:rPr>
+        <w:t>.</w:t>
+      </w:r>
+    </w:p>
+    <w:p>
+      <w:pPr>
+        <w:keepNext w:val="0"/>
+        <w:keepLines w:val="0"/>
+        <w:pageBreakBefore w:val="0"/>
+        <w:widowControl/>
+        <w:kinsoku/>
+        <w:wordWrap/>
+        <w:overflowPunct/>
+        <w:topLinePunct w:val="0"/>
+        <w:autoSpaceDE/>
+        <w:autoSpaceDN/>
+        <w:bidi w:val="0"/>
+        <w:adjustRightInd/>
+        <w:snapToGrid/>
+        <w:spacing w:before="0" w:line="240" w:lineRule="auto"/>
+        <w:ind w:firstLine="0"/>
+        <w:jc w:val="both"/>
+        <w:textAlignment w:val="auto"/>
+        <w:rPr>
+          <w:rFonts w:hint="default" w:ascii="Times New Roman" w:hAnsi="Times New Roman" w:eastAsia="宋体" w:cs="Times New Roman"/>
+          <w:b w:val="0"/>
+          <w:color w:val="FF0000"/>
+          <w:sz w:val="18"/>
+          <w:szCs w:val="18"/>
+        </w:rPr>
+      </w:pPr>
+      <w:r>
+        <w:rPr>
+          <w:rFonts w:hint="eastAsia" w:ascii="宋体" w:hAnsi="宋体" w:eastAsia="宋体" w:cs="宋体"/>
+          <w:b/>
+          <w:bCs/>
+          <w:color w:val="FF0000"/>
+          <w:sz w:val="18"/>
+          <w:szCs w:val="18"/>
+          <w:lang w:val="en-US" w:eastAsia="zh-CN"/>
+        </w:rPr>
+        <w:t>注意</w:t>
+      </w:r>
+      <w:r>
+        <w:rPr>
+          <w:rFonts w:hint="eastAsia" w:ascii="宋体" w:hAnsi="宋体" w:eastAsia="宋体" w:cs="宋体"/>
+          <w:b/>
+          <w:bCs/>
+          <w:color w:val="FF0000"/>
+          <w:sz w:val="18"/>
+          <w:szCs w:val="18"/>
+        </w:rPr>
+        <w:t>：</w:t>
+      </w:r>
+      <w:r>
+        <w:rPr>
+          <w:rFonts w:hint="eastAsia" w:ascii="宋体" w:hAnsi="宋体" w:eastAsia="宋体" w:cs="宋体"/>
+          <w:b w:val="0"/>
+          <w:color w:val="FF0000"/>
+          <w:sz w:val="18"/>
+          <w:szCs w:val="18"/>
+        </w:rPr>
+        <w:t>请完整填写各项信息；请在“</w:t>
+      </w:r>
+      <w:r>
+        <w:rPr>
+          <w:rFonts w:hint="default" w:ascii="Times New Roman" w:hAnsi="Times New Roman" w:eastAsia="宋体" w:cs="Times New Roman"/>
+          <w:b w:val="0"/>
+          <w:color w:val="FF0000"/>
+          <w:sz w:val="18"/>
+          <w:szCs w:val="18"/>
+        </w:rPr>
+        <w:t>Yes□/No□</w:t>
+      </w:r>
+      <w:r>
+        <w:rPr>
+          <w:rFonts w:hint="eastAsia" w:ascii="宋体" w:hAnsi="宋体" w:eastAsia="宋体" w:cs="宋体"/>
+          <w:b w:val="0"/>
+          <w:color w:val="FF0000"/>
+          <w:sz w:val="18"/>
+          <w:szCs w:val="18"/>
+        </w:rPr>
+        <w:t>”处打“√”</w:t>
+      </w:r>
+      <w:r>
+        <w:rPr>
+          <w:rFonts w:hint="eastAsia" w:ascii="宋体" w:hAnsi="宋体" w:eastAsia="宋体" w:cs="宋体"/>
+          <w:b w:val="0"/>
+          <w:color w:val="FF0000"/>
+          <w:sz w:val="18"/>
+          <w:szCs w:val="18"/>
+          <w:lang w:eastAsia="zh-CN"/>
+        </w:rPr>
+        <w:t>；港澳台居民请填写</w:t>
+      </w:r>
+      <w:r>
+        <w:rPr>
+          <w:rFonts w:hint="eastAsia" w:ascii="宋体" w:hAnsi="宋体" w:eastAsia="宋体" w:cs="宋体"/>
+          <w:b w:val="0"/>
+          <w:color w:val="FF0000"/>
+          <w:sz w:val="18"/>
+          <w:szCs w:val="18"/>
+          <w:lang w:val="en-US" w:eastAsia="zh-CN"/>
+        </w:rPr>
+        <w:t>往来大陆(内地）</w:t>
+      </w:r>
+      <w:r>
+        <w:rPr>
+          <w:rFonts w:hint="eastAsia" w:ascii="宋体" w:hAnsi="宋体" w:eastAsia="宋体" w:cs="宋体"/>
+          <w:b w:val="0"/>
+          <w:color w:val="FF0000"/>
+          <w:sz w:val="18"/>
+          <w:szCs w:val="18"/>
+          <w:lang w:eastAsia="zh-CN"/>
+        </w:rPr>
+        <w:t>通行证号码</w:t>
+      </w:r>
+      <w:r>
+        <w:rPr>
+          <w:rFonts w:hint="eastAsia" w:ascii="宋体" w:hAnsi="宋体" w:eastAsia="宋体" w:cs="宋体"/>
+          <w:b w:val="0"/>
+          <w:color w:val="FF0000"/>
+          <w:sz w:val="18"/>
+          <w:szCs w:val="18"/>
+          <w:lang w:val="en-US" w:eastAsia="zh-CN"/>
+        </w:rPr>
+        <w:t>。若有问题</w:t>
+      </w:r>
+      <w:r>
+        <w:rPr>
+          <w:rFonts w:hint="eastAsia" w:ascii="宋体" w:hAnsi="宋体" w:eastAsia="宋体" w:cs="宋体"/>
+          <w:b w:val="0"/>
+          <w:color w:val="FF0000"/>
+          <w:sz w:val="18"/>
+          <w:szCs w:val="18"/>
+        </w:rPr>
+        <w:t>请联系会务组</w:t>
+      </w:r>
+      <w:r>
+        <w:rPr>
+          <w:rFonts w:hint="eastAsia" w:ascii="宋体" w:hAnsi="宋体" w:eastAsia="宋体" w:cs="宋体"/>
+          <w:b w:val="0"/>
+          <w:color w:val="FF0000"/>
+          <w:sz w:val="18"/>
+          <w:szCs w:val="18"/>
+          <w:lang w:eastAsia="zh-CN"/>
+        </w:rPr>
+        <w:t>（</w:t>
+      </w:r>
+      <w:r>
+        <w:rPr>
+          <w:rFonts w:hint="eastAsia" w:ascii="宋体" w:hAnsi="宋体" w:eastAsia="宋体" w:cs="宋体"/>
+          <w:b w:val="0"/>
+          <w:color w:val="FF0000"/>
+          <w:sz w:val="18"/>
+          <w:szCs w:val="18"/>
+        </w:rPr>
+        <w:t xml:space="preserve">邮箱 </w:t>
+      </w:r>
+      <w:r>
+        <w:rPr>
+          <w:rFonts w:hint="default" w:ascii="Times New Roman" w:hAnsi="Times New Roman" w:eastAsia="宋体" w:cs="Times New Roman"/>
+          <w:b w:val="0"/>
+          <w:color w:val="FF0000"/>
+          <w:sz w:val="18"/>
+          <w:szCs w:val="18"/>
+          <w:lang w:val="en-US" w:eastAsia="zh-CN"/>
+        </w:rPr>
+        <w:t>sduforum</w:t>
+      </w:r>
+      <w:r>
+        <w:rPr>
+          <w:rFonts w:hint="default" w:ascii="Times New Roman" w:hAnsi="Times New Roman" w:eastAsia="宋体" w:cs="Times New Roman"/>
+          <w:b w:val="0"/>
+          <w:color w:val="FF0000"/>
+          <w:sz w:val="18"/>
+          <w:szCs w:val="18"/>
+        </w:rPr>
+        <w:t>@163.com</w:t>
+      </w:r>
+      <w:r>
+        <w:rPr>
+          <w:rFonts w:hint="default" w:ascii="Times New Roman" w:hAnsi="Times New Roman" w:cs="Times New Roman"/>
+          <w:b w:val="0"/>
+          <w:color w:val="FF0000"/>
+          <w:sz w:val="18"/>
+          <w:szCs w:val="18"/>
+          <w:lang w:eastAsia="zh-CN"/>
+        </w:rPr>
+        <w:t>）</w:t>
+      </w:r>
+      <w:r>
+        <w:rPr>
+          <w:rFonts w:hint="default" w:ascii="Times New Roman" w:hAnsi="Times New Roman" w:eastAsia="宋体" w:cs="Times New Roman"/>
+          <w:b w:val="0"/>
+          <w:color w:val="FF0000"/>
+          <w:sz w:val="18"/>
+          <w:szCs w:val="18"/>
+        </w:rPr>
+        <w:t>。</w:t>
+      </w:r>
+    </w:p>
+    <w:p>
+      <w:pPr>
+        <w:keepNext w:val="0"/>
+        <w:keepLines w:val="0"/>
+        <w:pageBreakBefore w:val="0"/>
+        <w:widowControl w:val="0"/>
+        <w:overflowPunct/>
+        <w:bidi w:val="0"/>
+        <w:snapToGrid/>
+        <w:spacing w:line="240" w:lineRule="auto"/>
+        <w:jc w:val="both"/>
+        <w:textAlignment w:val="auto"/>
+        <w:rPr>
+          <w:rFonts w:hint="default" w:ascii="Arial" w:hAnsi="Arial" w:eastAsia="宋体" w:cs="Arial"/>
+          <w:b w:val="0"/>
+          <w:bCs w:val="0"/>
+          <w:color w:val="FF0000"/>
+          <w:sz w:val="21"/>
+          <w:szCs w:val="21"/>
+          <w:shd w:val="clear" w:fill="auto"/>
+          <w:lang w:val="en-US" w:eastAsia="zh-CN"/>
+        </w:rPr>
+      </w:pPr>
+    </w:p>
+    <w:p>
+      <w:pPr>
+        <w:spacing w:line="360" w:lineRule="auto"/>
+        <w:jc w:val="center"/>
+        <w:rPr>
+          <w:rFonts w:ascii="Arial" w:hAnsi="Arial" w:cs="Arial"/>
+          <w:color w:val="000000"/>
+          <w:sz w:val="21"/>
+          <w:szCs w:val="21"/>
+        </w:rPr>
+      </w:pPr>
     </w:p>
     <w:sectPr>
       <w:footerReference r:id="rId6" w:type="first"/>
@@ -4807,30 +6433,33 @@
       <w:pStyle w:val="4"/>
     </w:pPr>
     <w:r>
+      <w:rPr>
+        <w:sz w:val="18"/>
+      </w:rPr>
       <mc:AlternateContent>
         <mc:Choice Requires="wps">
           <w:drawing>
-            <wp:anchor distT="0" distB="0" distL="0" distR="0" simplePos="0" relativeHeight="251659264" behindDoc="1" locked="0" layoutInCell="0" allowOverlap="1">
+            <wp:anchor distT="0" distB="0" distL="114300" distR="114300" simplePos="0" relativeHeight="251660288" behindDoc="0" locked="0" layoutInCell="1" allowOverlap="1">
               <wp:simplePos x="0" y="0"/>
               <wp:positionH relativeFrom="margin">
                 <wp:align>center</wp:align>
               </wp:positionH>
               <wp:positionV relativeFrom="paragraph">
-                <wp:posOffset>635</wp:posOffset>
+                <wp:posOffset>0</wp:posOffset>
               </wp:positionV>
-              <wp:extent cx="1828800" cy="138430"/>
+              <wp:extent cx="1828800" cy="1828800"/>
               <wp:effectExtent l="0" t="0" r="0" b="0"/>
               <wp:wrapNone/>
-              <wp:docPr id="7" name="文本框 1"/>
+              <wp:docPr id="7" name="文本框 7"/>
               <wp:cNvGraphicFramePr/>
               <a:graphic xmlns:a="http://schemas.openxmlformats.org/drawingml/2006/main">
                 <a:graphicData uri="http://schemas.microsoft.com/office/word/2010/wordprocessingShape">
                   <wps:wsp>
-                    <wps:cNvSpPr/>
+                    <wps:cNvSpPr txBox="1"/>
                     <wps:spPr>
                       <a:xfrm>
                         <a:off x="0" y="0"/>
-                        <a:ext cx="1828800" cy="138600"/>
+                        <a:ext cx="1828800" cy="1828800"/>
                       </a:xfrm>
                       <a:prstGeom prst="rect">
                         <a:avLst/>
@@ -4850,7 +6479,9 @@
                       <a:effectRef idx="0">
                         <a:schemeClr val="accent1"/>
                       </a:effectRef>
-                      <a:fontRef idx="minor"/>
+                      <a:fontRef idx="minor">
+                        <a:schemeClr val="dk1"/>
+                      </a:fontRef>
                     </wps:style>
                     <wps:txbx>
                       <w:txbxContent>
@@ -4859,75 +6490,42 @@
                             <w:pStyle w:val="4"/>
                           </w:pPr>
                           <w:r>
-                            <w:rPr>
-                              <w:color w:val="000000"/>
-                            </w:rPr>
                             <w:fldChar w:fldCharType="begin"/>
                           </w:r>
                           <w:r>
-                            <w:rPr>
-                              <w:color w:val="000000"/>
-                            </w:rPr>
-                            <w:instrText xml:space="preserve"> PAGE </w:instrText>
+                            <w:instrText xml:space="preserve"> PAGE  \* MERGEFORMAT </w:instrText>
                           </w:r>
                           <w:r>
-                            <w:rPr>
-                              <w:color w:val="000000"/>
-                            </w:rPr>
                             <w:fldChar w:fldCharType="separate"/>
                           </w:r>
                           <w:r>
-                            <w:rPr>
-                              <w:color w:val="000000"/>
-                            </w:rPr>
-                            <w:t>5</w:t>
+                            <w:t>1</w:t>
                           </w:r>
                           <w:r>
-                            <w:rPr>
-                              <w:color w:val="000000"/>
-                            </w:rPr>
                             <w:fldChar w:fldCharType="end"/>
                           </w:r>
                           <w:r>
-                            <w:rPr>
-                              <w:color w:val="000000"/>
-                            </w:rPr>
                             <w:t xml:space="preserve"> / </w:t>
                           </w:r>
                           <w:r>
-                            <w:rPr>
-                              <w:color w:val="000000"/>
-                            </w:rPr>
                             <w:fldChar w:fldCharType="begin"/>
                           </w:r>
                           <w:r>
-                            <w:rPr>
-                              <w:color w:val="000000"/>
-                            </w:rPr>
-                            <w:instrText xml:space="preserve"> NUMPAGES </w:instrText>
+                            <w:instrText xml:space="preserve"> NUMPAGES  \* MERGEFORMAT </w:instrText>
                           </w:r>
                           <w:r>
-                            <w:rPr>
-                              <w:color w:val="000000"/>
-                            </w:rPr>
                             <w:fldChar w:fldCharType="separate"/>
                           </w:r>
                           <w:r>
-                            <w:rPr>
-                              <w:color w:val="000000"/>
-                            </w:rPr>
-                            <w:t>5</w:t>
+                            <w:t>6</w:t>
                           </w:r>
                           <w:r>
-                            <w:rPr>
-                              <w:color w:val="000000"/>
-                            </w:rPr>
                             <w:fldChar w:fldCharType="end"/>
                           </w:r>
                         </w:p>
                       </w:txbxContent>
                     </wps:txbx>
-                    <wps:bodyPr lIns="0" tIns="0" rIns="0" bIns="0" anchor="t">
+                    <wps:bodyPr rot="0" spcFirstLastPara="0" vertOverflow="overflow" horzOverflow="overflow" vert="horz" wrap="none" lIns="0" tIns="0" rIns="0" bIns="0" numCol="1" spcCol="0" rtlCol="0" fromWordArt="0" anchor="t" anchorCtr="0" forceAA="0" upright="0" compatLnSpc="1">
                       <a:spAutoFit/>
                     </wps:bodyPr>
                   </wps:wsp>
@@ -4938,7 +6536,7 @@
         </mc:Choice>
         <mc:Fallback>
           <w:pict>
-            <v:rect id="文本框 1" o:spid="_x0000_s1026" o:spt="1" style="position:absolute;left:0pt;margin-top:0.05pt;height:10.9pt;width:144pt;mso-position-horizontal:center;mso-position-horizontal-relative:margin;z-index:-251657216;mso-width-relative:page;mso-height-relative:page;" filled="f" stroked="f" coordsize="21600,21600" o:allowincell="f" o:gfxdata="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">
+            <v:shape id="_x0000_s1026" o:spid="_x0000_s1026" o:spt="202" type="#_x0000_t202" style="position:absolute;left:0pt;margin-top:0pt;height:144pt;width:144pt;mso-position-horizontal:center;mso-position-horizontal-relative:margin;mso-wrap-style:none;z-index:251660288;mso-width-relative:page;mso-height-relative:page;" filled="f" stroked="f" coordsize="21600,21600" o:gfxdata="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">
               <v:fill on="f" focussize="0,0"/>
               <v:stroke on="f" weight="0.5pt"/>
               <v:imagedata o:title=""/>
@@ -4950,75 +6548,42 @@
                       <w:pStyle w:val="4"/>
                     </w:pPr>
                     <w:r>
-                      <w:rPr>
-                        <w:color w:val="000000"/>
-                      </w:rPr>
                       <w:fldChar w:fldCharType="begin"/>
                     </w:r>
                     <w:r>
-                      <w:rPr>
-                        <w:color w:val="000000"/>
-                      </w:rPr>
-                      <w:instrText xml:space="preserve"> PAGE </w:instrText>
+                      <w:instrText xml:space="preserve"> PAGE  \* MERGEFORMAT </w:instrText>
                     </w:r>
                     <w:r>
-                      <w:rPr>
-                        <w:color w:val="000000"/>
-                      </w:rPr>
                       <w:fldChar w:fldCharType="separate"/>
                     </w:r>
                     <w:r>
-                      <w:rPr>
-                        <w:color w:val="000000"/>
-                      </w:rPr>
-                      <w:t>5</w:t>
+                      <w:t>1</w:t>
                     </w:r>
                     <w:r>
-                      <w:rPr>
-                        <w:color w:val="000000"/>
-                      </w:rPr>
                       <w:fldChar w:fldCharType="end"/>
                     </w:r>
                     <w:r>
-                      <w:rPr>
-                        <w:color w:val="000000"/>
-                      </w:rPr>
                       <w:t xml:space="preserve"> / </w:t>
                     </w:r>
                     <w:r>
-                      <w:rPr>
-                        <w:color w:val="000000"/>
-                      </w:rPr>
                       <w:fldChar w:fldCharType="begin"/>
                     </w:r>
                     <w:r>
-                      <w:rPr>
-                        <w:color w:val="000000"/>
-                      </w:rPr>
-                      <w:instrText xml:space="preserve"> NUMPAGES </w:instrText>
+                      <w:instrText xml:space="preserve"> NUMPAGES  \* MERGEFORMAT </w:instrText>
                     </w:r>
                     <w:r>
-                      <w:rPr>
-                        <w:color w:val="000000"/>
-                      </w:rPr>
                       <w:fldChar w:fldCharType="separate"/>
                     </w:r>
                     <w:r>
-                      <w:rPr>
-                        <w:color w:val="000000"/>
-                      </w:rPr>
-                      <w:t>5</w:t>
+                      <w:t>6</w:t>
                     </w:r>
                     <w:r>
-                      <w:rPr>
-                        <w:color w:val="000000"/>
-                      </w:rPr>
                       <w:fldChar w:fldCharType="end"/>
                     </w:r>
                   </w:p>
                 </w:txbxContent>
               </v:textbox>
-            </v:rect>
+            </v:shape>
           </w:pict>
         </mc:Fallback>
       </mc:AlternateContent>
@@ -5386,7 +6951,7 @@
     <w:lsdException w:unhideWhenUsed="0" w:uiPriority="0" w:semiHidden="0" w:name="Body Text Indent 3"/>
     <w:lsdException w:unhideWhenUsed="0" w:uiPriority="0" w:semiHidden="0" w:name="Block Text"/>
     <w:lsdException w:qFormat="1" w:uiPriority="99" w:semiHidden="0" w:name="Hyperlink"/>
-    <w:lsdException w:unhideWhenUsed="0" w:uiPriority="0" w:semiHidden="0" w:name="FollowedHyperlink"/>
+    <w:lsdException w:qFormat="1" w:unhideWhenUsed="0" w:uiPriority="0" w:semiHidden="0" w:name="FollowedHyperlink"/>
     <w:lsdException w:qFormat="1" w:unhideWhenUsed="0" w:uiPriority="0" w:semiHidden="0" w:name="Strong"/>
     <w:lsdException w:qFormat="1" w:unhideWhenUsed="0" w:uiPriority="0" w:semiHidden="0" w:name="Emphasis"/>
     <w:lsdException w:unhideWhenUsed="0" w:uiPriority="0" w:semiHidden="0" w:name="Document Map"/>
@@ -5661,6 +7226,16 @@
     </w:rPr>
   </w:style>
   <w:style w:type="character" w:styleId="9">
+    <w:name w:val="FollowedHyperlink"/>
+    <w:basedOn w:val="8"/>
+    <w:qFormat/>
+    <w:uiPriority w:val="0"/>
+    <w:rPr>
+      <w:color w:val="800080"/>
+      <w:u w:val="single"/>
+    </w:rPr>
+  </w:style>
+  <w:style w:type="character" w:styleId="10">
     <w:name w:val="Hyperlink"/>
     <w:basedOn w:val="8"/>
     <w:unhideWhenUsed/>
@@ -5676,7 +7251,7 @@
       </w14:textFill>
     </w:rPr>
   </w:style>
-  <w:style w:type="paragraph" w:customStyle="1" w:styleId="10">
+  <w:style w:type="paragraph" w:customStyle="1" w:styleId="11">
     <w:name w:val="Heading"/>
     <w:basedOn w:val="1"/>
     <w:next w:val="3"/>
@@ -5692,7 +7267,7 @@
       <w:szCs w:val="28"/>
     </w:rPr>
   </w:style>
-  <w:style w:type="paragraph" w:customStyle="1" w:styleId="11">
+  <w:style w:type="paragraph" w:customStyle="1" w:styleId="12">
     <w:name w:val="Index"/>
     <w:basedOn w:val="1"/>
     <w:qFormat/>
@@ -5704,13 +7279,13 @@
       <w:rFonts w:cs="Lucida Sans"/>
     </w:rPr>
   </w:style>
-  <w:style w:type="paragraph" w:customStyle="1" w:styleId="12">
+  <w:style w:type="paragraph" w:customStyle="1" w:styleId="13">
     <w:name w:val="Header and Footer"/>
     <w:basedOn w:val="1"/>
     <w:qFormat/>
     <w:uiPriority w:val="0"/>
   </w:style>
-  <w:style w:type="paragraph" w:styleId="13">
+  <w:style w:type="paragraph" w:styleId="14">
     <w:name w:val="List Paragraph"/>
     <w:basedOn w:val="1"/>
     <w:qFormat/>
@@ -5721,13 +7296,13 @@
       <w:contextualSpacing/>
     </w:pPr>
   </w:style>
-  <w:style w:type="paragraph" w:customStyle="1" w:styleId="14">
+  <w:style w:type="paragraph" w:customStyle="1" w:styleId="15">
     <w:name w:val="Frame Contents (user)"/>
     <w:basedOn w:val="1"/>
     <w:qFormat/>
     <w:uiPriority w:val="0"/>
   </w:style>
-  <w:style w:type="paragraph" w:customStyle="1" w:styleId="15">
+  <w:style w:type="paragraph" w:customStyle="1" w:styleId="16">
     <w:name w:val="Frame Contents"/>
     <w:basedOn w:val="1"/>
     <w:qFormat/>

</xml_diff>